<commit_message>
added stuff to documentation
</commit_message>
<xml_diff>
--- a/Documentation.docx
+++ b/Documentation.docx
@@ -239,7 +239,55 @@
           <w:rFonts w:ascii="David" w:hAnsi="David" w:cs="David" w:hint="cs"/>
           <w:rtl/>
         </w:rPr>
-        <w:t xml:space="preserve"> ממירוצים רשמיים.</w:t>
+        <w:t xml:space="preserve"> מ</w:t>
+      </w:r>
+      <w:r>
+        <w:rPr>
+          <w:rFonts w:ascii="David" w:hAnsi="David" w:cs="David" w:hint="cs"/>
+          <w:rtl/>
+        </w:rPr>
+        <w:t xml:space="preserve">-4 </w:t>
+      </w:r>
+      <w:r>
+        <w:rPr>
+          <w:rFonts w:ascii="David" w:hAnsi="David" w:cs="David" w:hint="cs"/>
+          <w:rtl/>
+        </w:rPr>
+        <w:t>מירוצים רשמיים</w:t>
+      </w:r>
+      <w:r>
+        <w:rPr>
+          <w:rFonts w:ascii="David" w:hAnsi="David" w:cs="David" w:hint="cs"/>
+          <w:rtl/>
+        </w:rPr>
+        <w:t xml:space="preserve"> שהתקיימו בשנת 2023 </w:t>
+      </w:r>
+      <w:r>
+        <w:rPr>
+          <w:rFonts w:ascii="David" w:hAnsi="David" w:cs="David"/>
+          <w:rtl/>
+        </w:rPr>
+        <w:t>–</w:t>
+      </w:r>
+      <w:r>
+        <w:rPr>
+          <w:rFonts w:ascii="David" w:hAnsi="David" w:cs="David" w:hint="cs"/>
+          <w:rtl/>
+        </w:rPr>
+        <w:t xml:space="preserve"> </w:t>
+      </w:r>
+      <w:r>
+        <w:rPr>
+          <w:rFonts w:ascii="David" w:hAnsi="David" w:cs="David"/>
+        </w:rPr>
+        <w:t>Monza, Singapore, Spa, Suzuka</w:t>
+      </w:r>
+      <w:r>
+        <w:rPr>
+          <w:rFonts w:ascii="David" w:hAnsi="David" w:cs="David" w:hint="cs"/>
+          <w:rtl/>
+        </w:rPr>
+        <w:t>.</w:t>
       </w:r>
     </w:p>
     <w:p>
@@ -1913,7 +1961,7 @@
       <w:pPr>
         <w:spacing w:after="0" w:line="360" w:lineRule="auto"/>
         <w:rPr>
-          <w:rFonts w:ascii="David" w:hAnsi="David" w:cs="David" w:hint="cs"/>
+          <w:rFonts w:ascii="David" w:hAnsi="David" w:cs="David"/>
         </w:rPr>
       </w:pPr>
     </w:p>

</xml_diff>

<commit_message>
final dataset cleaning and feature selection
</commit_message>
<xml_diff>
--- a/Documentation.docx
+++ b/Documentation.docx
@@ -7,6 +7,7 @@
         <w:pBdr>
           <w:bottom w:val="single" w:sz="6" w:space="1" w:color="auto"/>
         </w:pBdr>
+        <w:bidi w:val="0"/>
         <w:spacing w:after="0" w:line="360" w:lineRule="auto"/>
         <w:jc w:val="center"/>
         <w:rPr>
@@ -33,6 +34,7 @@
         <w:pBdr>
           <w:bottom w:val="single" w:sz="6" w:space="1" w:color="auto"/>
         </w:pBdr>
+        <w:bidi w:val="0"/>
         <w:spacing w:after="0" w:line="360" w:lineRule="auto"/>
         <w:jc w:val="center"/>
         <w:rPr>
@@ -56,6 +58,7 @@
     </w:p>
     <w:p>
       <w:pPr>
+        <w:bidi w:val="0"/>
         <w:spacing w:after="0" w:line="360" w:lineRule="auto"/>
         <w:rPr>
           <w:rFonts w:ascii="David" w:hAnsi="David" w:cs="David"/>
@@ -69,6 +72,7 @@
         <w:pBdr>
           <w:bottom w:val="single" w:sz="6" w:space="1" w:color="auto"/>
         </w:pBdr>
+        <w:bidi w:val="0"/>
         <w:spacing w:after="0" w:line="360" w:lineRule="auto"/>
         <w:rPr>
           <w:rFonts w:ascii="David" w:hAnsi="David" w:cs="David"/>
@@ -79,6 +83,26 @@
           <w:rtl/>
         </w:rPr>
       </w:pPr>
+      <w:r>
+        <w:rPr>
+          <w:rFonts w:ascii="David" w:hAnsi="David" w:cs="David"/>
+          <w:b/>
+          <w:bCs/>
+          <w:sz w:val="32"/>
+          <w:szCs w:val="32"/>
+        </w:rPr>
+        <w:t>Basic information about the d</w:t>
+      </w:r>
+      <w:r>
+        <w:rPr>
+          <w:rFonts w:ascii="David" w:hAnsi="David" w:cs="David"/>
+          <w:b/>
+          <w:bCs/>
+          <w:sz w:val="32"/>
+          <w:szCs w:val="32"/>
+        </w:rPr>
+        <w:t>ataset</w:t>
+      </w:r>
       <w:r>
         <w:rPr>
           <w:rFonts w:ascii="David" w:hAnsi="David" w:cs="David" w:hint="cs"/>
@@ -88,8 +112,232 @@
           <w:szCs w:val="32"/>
           <w:rtl/>
         </w:rPr>
-        <w:t>מידע בסיסי על ה-</w:t>
-      </w:r>
+        <w:t>:</w:t>
+      </w:r>
+    </w:p>
+    <w:p>
+      <w:pPr>
+        <w:bidi w:val="0"/>
+        <w:spacing w:after="0" w:line="360" w:lineRule="auto"/>
+        <w:rPr>
+          <w:rFonts w:ascii="David" w:hAnsi="David" w:cs="David"/>
+          <w:rtl/>
+        </w:rPr>
+      </w:pPr>
+    </w:p>
+    <w:p>
+      <w:pPr>
+        <w:pStyle w:val="ListParagraph"/>
+        <w:numPr>
+          <w:ilvl w:val="0"/>
+          <w:numId w:val="10"/>
+        </w:numPr>
+        <w:bidi w:val="0"/>
+        <w:spacing w:after="0" w:line="360" w:lineRule="auto"/>
+        <w:rPr>
+          <w:rFonts w:ascii="David" w:hAnsi="David" w:cs="David"/>
+        </w:rPr>
+      </w:pPr>
+      <w:r>
+        <w:rPr>
+          <w:rFonts w:ascii="David" w:hAnsi="David" w:cs="David"/>
+          <w:b/>
+          <w:bCs/>
+        </w:rPr>
+        <w:t xml:space="preserve">Dataset name: </w:t>
+      </w:r>
+      <w:r>
+        <w:rPr>
+          <w:rFonts w:ascii="David" w:hAnsi="David" w:cs="David" w:hint="cs"/>
+        </w:rPr>
+        <w:t>F1 Driver Cornering Telemetry (Custom Built Dataset)</w:t>
+      </w:r>
+    </w:p>
+    <w:p>
+      <w:pPr>
+        <w:pStyle w:val="ListParagraph"/>
+        <w:numPr>
+          <w:ilvl w:val="0"/>
+          <w:numId w:val="10"/>
+        </w:numPr>
+        <w:bidi w:val="0"/>
+        <w:spacing w:after="0" w:line="360" w:lineRule="auto"/>
+        <w:rPr>
+          <w:rFonts w:ascii="David" w:hAnsi="David" w:cs="David"/>
+        </w:rPr>
+      </w:pPr>
+      <w:r>
+        <w:rPr>
+          <w:rFonts w:ascii="David" w:hAnsi="David" w:cs="David"/>
+          <w:b/>
+          <w:bCs/>
+        </w:rPr>
+        <w:t xml:space="preserve">Data origin: </w:t>
+      </w:r>
+      <w:r>
+        <w:rPr>
+          <w:rFonts w:ascii="David" w:hAnsi="David" w:cs="David"/>
+        </w:rPr>
+        <w:t xml:space="preserve">Live telemetry of F1 cars from 4 official events that happened during 2023: Monza, Singapore, Spa, Suzuka. The information was extracted using </w:t>
+      </w:r>
+      <w:hyperlink r:id="rId5" w:history="1">
+        <w:r>
+          <w:rPr>
+            <w:rStyle w:val="Hyperlink"/>
+            <w:rFonts w:ascii="David" w:hAnsi="David" w:cs="David"/>
+          </w:rPr>
+          <w:t>OpenF1</w:t>
+        </w:r>
+      </w:hyperlink>
+      <w:r>
+        <w:rPr>
+          <w:rFonts w:ascii="David" w:hAnsi="David" w:cs="David"/>
+        </w:rPr>
+        <w:t xml:space="preserve"> project’s API.</w:t>
+      </w:r>
+    </w:p>
+    <w:p>
+      <w:pPr>
+        <w:pStyle w:val="ListParagraph"/>
+        <w:numPr>
+          <w:ilvl w:val="0"/>
+          <w:numId w:val="10"/>
+        </w:numPr>
+        <w:bidi w:val="0"/>
+        <w:spacing w:after="0" w:line="360" w:lineRule="auto"/>
+        <w:rPr>
+          <w:rFonts w:ascii="David" w:hAnsi="David" w:cs="David"/>
+        </w:rPr>
+      </w:pPr>
+      <w:r>
+        <w:rPr>
+          <w:rFonts w:ascii="David" w:hAnsi="David" w:cs="David"/>
+          <w:b/>
+          <w:bCs/>
+        </w:rPr>
+        <w:t xml:space="preserve">Number of samples: </w:t>
+      </w:r>
+      <w:r>
+        <w:rPr>
+          <w:rFonts w:ascii="David" w:hAnsi="David" w:cs="David"/>
+        </w:rPr>
+        <w:t>1109</w:t>
+      </w:r>
+    </w:p>
+    <w:p>
+      <w:pPr>
+        <w:pStyle w:val="ListParagraph"/>
+        <w:numPr>
+          <w:ilvl w:val="0"/>
+          <w:numId w:val="10"/>
+        </w:numPr>
+        <w:bidi w:val="0"/>
+        <w:spacing w:after="0" w:line="360" w:lineRule="auto"/>
+        <w:rPr>
+          <w:rFonts w:ascii="David" w:hAnsi="David" w:cs="David"/>
+        </w:rPr>
+      </w:pPr>
+      <w:r>
+        <w:rPr>
+          <w:rFonts w:ascii="David" w:hAnsi="David" w:cs="David"/>
+          <w:b/>
+          <w:bCs/>
+        </w:rPr>
+        <w:t>Number of identifiers:</w:t>
+      </w:r>
+      <w:r>
+        <w:rPr>
+          <w:rFonts w:ascii="David" w:hAnsi="David" w:cs="David"/>
+        </w:rPr>
+        <w:t xml:space="preserve"> 3</w:t>
+      </w:r>
+    </w:p>
+    <w:p>
+      <w:pPr>
+        <w:pStyle w:val="ListParagraph"/>
+        <w:numPr>
+          <w:ilvl w:val="0"/>
+          <w:numId w:val="10"/>
+        </w:numPr>
+        <w:bidi w:val="0"/>
+        <w:spacing w:after="0" w:line="360" w:lineRule="auto"/>
+        <w:rPr>
+          <w:rFonts w:ascii="David" w:hAnsi="David" w:cs="David"/>
+        </w:rPr>
+      </w:pPr>
+      <w:r>
+        <w:rPr>
+          <w:rFonts w:ascii="David" w:hAnsi="David" w:cs="David"/>
+          <w:b/>
+          <w:bCs/>
+        </w:rPr>
+        <w:t>Number of features:</w:t>
+      </w:r>
+      <w:r>
+        <w:rPr>
+          <w:rFonts w:ascii="David" w:hAnsi="David" w:cs="David"/>
+        </w:rPr>
+        <w:t xml:space="preserve"> </w:t>
+      </w:r>
+      <w:r>
+        <w:rPr>
+          <w:rFonts w:ascii="David" w:hAnsi="David" w:cs="David"/>
+        </w:rPr>
+        <w:t>12</w:t>
+      </w:r>
+    </w:p>
+    <w:p>
+      <w:pPr>
+        <w:pStyle w:val="ListParagraph"/>
+        <w:numPr>
+          <w:ilvl w:val="0"/>
+          <w:numId w:val="10"/>
+        </w:numPr>
+        <w:bidi w:val="0"/>
+        <w:spacing w:after="0" w:line="360" w:lineRule="auto"/>
+        <w:rPr>
+          <w:rFonts w:ascii="David" w:hAnsi="David" w:cs="David"/>
+        </w:rPr>
+      </w:pPr>
+      <w:r>
+        <w:rPr>
+          <w:rFonts w:ascii="David" w:hAnsi="David" w:cs="David"/>
+          <w:b/>
+          <w:bCs/>
+        </w:rPr>
+        <w:t>The Domain:</w:t>
+      </w:r>
+      <w:r>
+        <w:rPr>
+          <w:rFonts w:ascii="David" w:hAnsi="David" w:cs="David"/>
+        </w:rPr>
+        <w:t xml:space="preserve"> The data comes from sensor measurments installed on each F1 car, that measure the telemetry data of  the car at 3.7Hz (almost 4 times a second).</w:t>
+      </w:r>
+    </w:p>
+    <w:p>
+      <w:pPr>
+        <w:bidi w:val="0"/>
+        <w:spacing w:after="0" w:line="360" w:lineRule="auto"/>
+        <w:rPr>
+          <w:rFonts w:ascii="David" w:hAnsi="David" w:cs="David"/>
+          <w:rtl/>
+        </w:rPr>
+      </w:pPr>
+    </w:p>
+    <w:p>
+      <w:pPr>
+        <w:pBdr>
+          <w:bottom w:val="single" w:sz="6" w:space="1" w:color="auto"/>
+        </w:pBdr>
+        <w:bidi w:val="0"/>
+        <w:spacing w:after="0" w:line="360" w:lineRule="auto"/>
+        <w:rPr>
+          <w:rFonts w:ascii="David" w:hAnsi="David" w:cs="David"/>
+          <w:sz w:val="32"/>
+          <w:szCs w:val="32"/>
+          <w:rtl/>
+        </w:rPr>
+      </w:pPr>
       <w:r>
         <w:rPr>
           <w:rFonts w:ascii="David" w:hAnsi="David" w:cs="David"/>
@@ -98,1870 +346,1663 @@
           <w:sz w:val="32"/>
           <w:szCs w:val="32"/>
         </w:rPr>
-        <w:t>Dataset</w:t>
-      </w:r>
-      <w:r>
-        <w:rPr>
-          <w:rFonts w:ascii="David" w:hAnsi="David" w:cs="David" w:hint="cs"/>
-          <w:b/>
-          <w:bCs/>
-          <w:sz w:val="32"/>
-          <w:szCs w:val="32"/>
-          <w:rtl/>
-        </w:rPr>
-        <w:t>:</w:t>
-      </w:r>
-    </w:p>
-    <w:p>
-      <w:pPr>
-        <w:spacing w:after="0" w:line="360" w:lineRule="auto"/>
-        <w:rPr>
-          <w:rFonts w:ascii="David" w:hAnsi="David" w:cs="David"/>
-          <w:rtl/>
-        </w:rPr>
-      </w:pPr>
-    </w:p>
-    <w:p>
-      <w:pPr>
-        <w:pStyle w:val="ListParagraph"/>
-        <w:numPr>
-          <w:ilvl w:val="0"/>
-          <w:numId w:val="10"/>
-        </w:numPr>
-        <w:spacing w:after="0" w:line="360" w:lineRule="auto"/>
-        <w:rPr>
-          <w:rFonts w:ascii="David" w:hAnsi="David" w:cs="David"/>
-        </w:rPr>
-      </w:pPr>
-      <w:r>
-        <w:rPr>
-          <w:rFonts w:ascii="David" w:hAnsi="David" w:cs="David" w:hint="cs"/>
+        <w:t>Feature Understanding:</w:t>
+      </w:r>
+    </w:p>
+    <w:p>
+      <w:pPr>
+        <w:bidi w:val="0"/>
+        <w:spacing w:after="0" w:line="360" w:lineRule="auto"/>
+        <w:rPr>
+          <w:rFonts w:ascii="David" w:hAnsi="David" w:cs="David"/>
           <w:b/>
           <w:bCs/>
           <w:rtl/>
         </w:rPr>
-        <w:t>שם ה-</w:t>
-      </w:r>
+      </w:pPr>
+    </w:p>
+    <w:p>
+      <w:pPr>
+        <w:bidi w:val="0"/>
+        <w:spacing w:after="0" w:line="360" w:lineRule="auto"/>
+        <w:rPr>
+          <w:rFonts w:ascii="David" w:hAnsi="David" w:cs="David"/>
+        </w:rPr>
+      </w:pPr>
       <w:r>
         <w:rPr>
           <w:rFonts w:ascii="David" w:hAnsi="David" w:cs="David"/>
           <w:b/>
           <w:bCs/>
         </w:rPr>
-        <w:t>Dataset</w:t>
+        <w:t xml:space="preserve">The rows of the dataset: </w:t>
+      </w:r>
+      <w:r>
+        <w:rPr>
+          <w:rFonts w:ascii="David" w:hAnsi="David" w:cs="David"/>
+        </w:rPr>
+        <w:t>Each row in the dataset represents a turn that a certain driver made during his fastest lap in a certain event.</w:t>
+      </w:r>
+    </w:p>
+    <w:p>
+      <w:pPr>
+        <w:bidi w:val="0"/>
+        <w:spacing w:after="0" w:line="360" w:lineRule="auto"/>
+        <w:rPr>
+          <w:rFonts w:ascii="David" w:hAnsi="David" w:cs="David"/>
+          <w:b/>
+          <w:bCs/>
+        </w:rPr>
+      </w:pPr>
+      <w:r>
+        <w:rPr>
+          <w:rFonts w:ascii="David" w:hAnsi="David" w:cs="David"/>
+          <w:b/>
+          <w:bCs/>
+        </w:rPr>
+        <w:t>The dataset columns:</w:t>
+      </w:r>
+    </w:p>
+    <w:p>
+      <w:pPr>
+        <w:bidi w:val="0"/>
+        <w:spacing w:after="0" w:line="360" w:lineRule="auto"/>
+        <w:rPr>
+          <w:rFonts w:ascii="David" w:hAnsi="David" w:cs="David"/>
+        </w:rPr>
+      </w:pPr>
+      <w:r>
+        <w:rPr>
+          <w:rFonts w:ascii="David" w:hAnsi="David" w:cs="David"/>
+          <w:b/>
+          <w:bCs/>
+        </w:rPr>
+        <w:tab/>
+        <w:t>Indentifiers:</w:t>
+      </w:r>
+    </w:p>
+    <w:p>
+      <w:pPr>
+        <w:pStyle w:val="ListParagraph"/>
+        <w:numPr>
+          <w:ilvl w:val="0"/>
+          <w:numId w:val="14"/>
+        </w:numPr>
+        <w:bidi w:val="0"/>
+        <w:spacing w:after="0" w:line="360" w:lineRule="auto"/>
+        <w:rPr>
+          <w:rFonts w:ascii="David" w:hAnsi="David" w:cs="David"/>
+        </w:rPr>
+      </w:pPr>
+      <w:r>
+        <w:rPr>
+          <w:rFonts w:ascii="David" w:hAnsi="David" w:cs="David"/>
+        </w:rPr>
+        <w:t>t</w:t>
+      </w:r>
+      <w:r>
+        <w:rPr>
+          <w:rFonts w:ascii="David" w:hAnsi="David" w:cs="David"/>
+        </w:rPr>
+        <w:t>rack – the name of the track</w:t>
+      </w:r>
+    </w:p>
+    <w:p>
+      <w:pPr>
+        <w:pStyle w:val="ListParagraph"/>
+        <w:numPr>
+          <w:ilvl w:val="1"/>
+          <w:numId w:val="14"/>
+        </w:numPr>
+        <w:bidi w:val="0"/>
+        <w:spacing w:after="0" w:line="360" w:lineRule="auto"/>
+        <w:rPr>
+          <w:rFonts w:ascii="David" w:hAnsi="David" w:cs="David"/>
+        </w:rPr>
+      </w:pPr>
+      <w:r>
+        <w:rPr>
+          <w:rFonts w:ascii="David" w:hAnsi="David" w:cs="David"/>
+        </w:rPr>
+        <w:t>Units: irrelevant.</w:t>
+      </w:r>
+    </w:p>
+    <w:p>
+      <w:pPr>
+        <w:pStyle w:val="ListParagraph"/>
+        <w:numPr>
+          <w:ilvl w:val="1"/>
+          <w:numId w:val="14"/>
+        </w:numPr>
+        <w:bidi w:val="0"/>
+        <w:spacing w:after="0" w:line="360" w:lineRule="auto"/>
+        <w:rPr>
+          <w:rFonts w:ascii="David" w:hAnsi="David" w:cs="David"/>
+        </w:rPr>
+      </w:pPr>
+      <w:r>
+        <w:rPr>
+          <w:rFonts w:ascii="David" w:hAnsi="David" w:cs="David"/>
+        </w:rPr>
+        <w:t>Possible value range: {Monza, Singapore, Spa, Suzuka}.</w:t>
+      </w:r>
+    </w:p>
+    <w:p>
+      <w:pPr>
+        <w:pStyle w:val="ListParagraph"/>
+        <w:numPr>
+          <w:ilvl w:val="0"/>
+          <w:numId w:val="14"/>
+        </w:numPr>
+        <w:bidi w:val="0"/>
+        <w:spacing w:after="0" w:line="360" w:lineRule="auto"/>
+        <w:rPr>
+          <w:rFonts w:ascii="David" w:hAnsi="David" w:cs="David"/>
+        </w:rPr>
+      </w:pPr>
+      <w:r>
+        <w:rPr>
+          <w:rFonts w:ascii="David" w:hAnsi="David" w:cs="David"/>
+        </w:rPr>
+        <w:t>g</w:t>
+      </w:r>
+      <w:r>
+        <w:rPr>
+          <w:rFonts w:ascii="David" w:hAnsi="David" w:cs="David"/>
+        </w:rPr>
+        <w:t>lobal_</w:t>
+      </w:r>
+      <w:r>
+        <w:rPr>
+          <w:rFonts w:ascii="David" w:hAnsi="David" w:cs="David"/>
+        </w:rPr>
+        <w:t>c</w:t>
+      </w:r>
+      <w:r>
+        <w:rPr>
+          <w:rFonts w:ascii="David" w:hAnsi="David" w:cs="David"/>
+        </w:rPr>
+        <w:t>orner_</w:t>
+      </w:r>
+      <w:r>
+        <w:rPr>
+          <w:rFonts w:ascii="David" w:hAnsi="David" w:cs="David"/>
+        </w:rPr>
+        <w:t>id</w:t>
+      </w:r>
+      <w:r>
+        <w:rPr>
+          <w:rFonts w:ascii="David" w:hAnsi="David" w:cs="David"/>
+        </w:rPr>
+        <w:t xml:space="preserve"> – a unique identifier given to every corner </w:t>
+      </w:r>
+      <w:r>
+        <w:rPr>
+          <w:rFonts w:ascii="David" w:hAnsi="David" w:cs="David"/>
+        </w:rPr>
+        <w:t xml:space="preserve">during </w:t>
+      </w:r>
+      <w:r>
+        <w:rPr>
+          <w:rFonts w:ascii="David" w:hAnsi="David" w:cs="David"/>
+        </w:rPr>
+        <w:t>the corner detection process.</w:t>
+      </w:r>
+    </w:p>
+    <w:p>
+      <w:pPr>
+        <w:pStyle w:val="ListParagraph"/>
+        <w:numPr>
+          <w:ilvl w:val="1"/>
+          <w:numId w:val="14"/>
+        </w:numPr>
+        <w:bidi w:val="0"/>
+        <w:spacing w:after="0" w:line="360" w:lineRule="auto"/>
+        <w:rPr>
+          <w:rFonts w:ascii="David" w:hAnsi="David" w:cs="David"/>
+        </w:rPr>
+      </w:pPr>
+      <w:r>
+        <w:rPr>
+          <w:rFonts w:ascii="David" w:hAnsi="David" w:cs="David"/>
+        </w:rPr>
+        <w:t>Units: ireelevant.</w:t>
+      </w:r>
+    </w:p>
+    <w:p>
+      <w:pPr>
+        <w:pStyle w:val="ListParagraph"/>
+        <w:numPr>
+          <w:ilvl w:val="1"/>
+          <w:numId w:val="14"/>
+        </w:numPr>
+        <w:bidi w:val="0"/>
+        <w:spacing w:after="0" w:line="360" w:lineRule="auto"/>
+        <w:rPr>
+          <w:rFonts w:ascii="David" w:hAnsi="David" w:cs="David"/>
+        </w:rPr>
+      </w:pPr>
+      <w:r>
+        <w:rPr>
+          <w:rFonts w:ascii="David" w:hAnsi="David" w:cs="David"/>
+        </w:rPr>
+        <w:t>Possible value range: {101-110, 201-216, 301-316, 401-416}</w:t>
+      </w:r>
+      <w:r>
+        <w:rPr>
+          <w:rFonts w:ascii="David" w:hAnsi="David" w:cs="David"/>
+        </w:rPr>
+        <w:t>.</w:t>
+      </w:r>
+    </w:p>
+    <w:p>
+      <w:pPr>
+        <w:pStyle w:val="ListParagraph"/>
+        <w:numPr>
+          <w:ilvl w:val="0"/>
+          <w:numId w:val="14"/>
+        </w:numPr>
+        <w:bidi w:val="0"/>
+        <w:spacing w:after="0" w:line="360" w:lineRule="auto"/>
+        <w:rPr>
+          <w:rFonts w:ascii="David" w:hAnsi="David" w:cs="David"/>
+        </w:rPr>
+      </w:pPr>
+      <w:r>
+        <w:rPr>
+          <w:rFonts w:ascii="David" w:hAnsi="David" w:cs="David"/>
+        </w:rPr>
+        <w:t xml:space="preserve">driver_number – </w:t>
+      </w:r>
+      <w:r>
+        <w:rPr>
+          <w:rFonts w:ascii="David" w:hAnsi="David" w:cs="David"/>
+        </w:rPr>
+        <w:t>a unique identifier given to every F1 driver.</w:t>
+      </w:r>
+    </w:p>
+    <w:p>
+      <w:pPr>
+        <w:pStyle w:val="ListParagraph"/>
+        <w:numPr>
+          <w:ilvl w:val="1"/>
+          <w:numId w:val="14"/>
+        </w:numPr>
+        <w:bidi w:val="0"/>
+        <w:spacing w:after="0" w:line="360" w:lineRule="auto"/>
+        <w:rPr>
+          <w:rFonts w:ascii="David" w:hAnsi="David" w:cs="David"/>
+        </w:rPr>
+      </w:pPr>
+      <w:r>
+        <w:rPr>
+          <w:rFonts w:ascii="David" w:hAnsi="David" w:cs="David"/>
+        </w:rPr>
+        <w:t>Units: ireelevant.</w:t>
+      </w:r>
+    </w:p>
+    <w:p>
+      <w:pPr>
+        <w:pStyle w:val="ListParagraph"/>
+        <w:numPr>
+          <w:ilvl w:val="1"/>
+          <w:numId w:val="14"/>
+        </w:numPr>
+        <w:bidi w:val="0"/>
+        <w:spacing w:after="0" w:line="360" w:lineRule="auto"/>
+        <w:rPr>
+          <w:rFonts w:ascii="David" w:hAnsi="David" w:cs="David"/>
+        </w:rPr>
+      </w:pPr>
+      <w:r>
+        <w:rPr>
+          <w:rFonts w:ascii="David" w:hAnsi="David" w:cs="David"/>
+        </w:rPr>
+        <w:t xml:space="preserve">Possible value range: </w:t>
+      </w:r>
+      <w:r>
+        <w:rPr>
+          <w:rFonts w:ascii="David" w:hAnsi="David" w:cs="David"/>
+        </w:rPr>
+        <w:t>{</w:t>
+      </w:r>
+      <w:r>
+        <w:rPr>
+          <w:rFonts w:ascii="David" w:hAnsi="David" w:cs="David"/>
+        </w:rPr>
+        <w:t>1</w:t>
+      </w:r>
+      <w:r>
+        <w:rPr>
+          <w:rFonts w:ascii="David" w:hAnsi="David" w:cs="David"/>
+        </w:rPr>
+        <w:t xml:space="preserve">, </w:t>
+      </w:r>
+      <w:r>
+        <w:rPr>
+          <w:rFonts w:ascii="David" w:hAnsi="David" w:cs="David"/>
+        </w:rPr>
+        <w:t>2</w:t>
+      </w:r>
+      <w:r>
+        <w:rPr>
+          <w:rFonts w:ascii="David" w:hAnsi="David" w:cs="David"/>
+        </w:rPr>
+        <w:t>,</w:t>
+      </w:r>
+      <w:r>
+        <w:rPr>
+          <w:rFonts w:ascii="David" w:hAnsi="David" w:cs="David"/>
+        </w:rPr>
+        <w:t xml:space="preserve"> 3,</w:t>
+      </w:r>
+      <w:r>
+        <w:rPr>
+          <w:rFonts w:ascii="David" w:hAnsi="David" w:cs="David"/>
+        </w:rPr>
+        <w:t xml:space="preserve"> </w:t>
+      </w:r>
+      <w:r>
+        <w:rPr>
+          <w:rFonts w:ascii="David" w:hAnsi="David" w:cs="David"/>
+        </w:rPr>
+        <w:t>4</w:t>
+      </w:r>
+      <w:r>
+        <w:rPr>
+          <w:rFonts w:ascii="David" w:hAnsi="David" w:cs="David"/>
+        </w:rPr>
+        <w:t xml:space="preserve">, </w:t>
+      </w:r>
+      <w:r>
+        <w:rPr>
+          <w:rFonts w:ascii="David" w:hAnsi="David" w:cs="David"/>
+        </w:rPr>
+        <w:t>10</w:t>
+      </w:r>
+      <w:r>
+        <w:rPr>
+          <w:rFonts w:ascii="David" w:hAnsi="David" w:cs="David"/>
+        </w:rPr>
+        <w:t xml:space="preserve">, </w:t>
+      </w:r>
+      <w:r>
+        <w:rPr>
+          <w:rFonts w:ascii="David" w:hAnsi="David" w:cs="David"/>
+        </w:rPr>
+        <w:t>11</w:t>
+      </w:r>
+      <w:r>
+        <w:rPr>
+          <w:rFonts w:ascii="David" w:hAnsi="David" w:cs="David"/>
+        </w:rPr>
+        <w:t xml:space="preserve">, </w:t>
+      </w:r>
+      <w:r>
+        <w:rPr>
+          <w:rFonts w:ascii="David" w:hAnsi="David" w:cs="David"/>
+        </w:rPr>
+        <w:t>14</w:t>
+      </w:r>
+      <w:r>
+        <w:rPr>
+          <w:rFonts w:ascii="David" w:hAnsi="David" w:cs="David"/>
+        </w:rPr>
+        <w:t xml:space="preserve">, </w:t>
+      </w:r>
+      <w:r>
+        <w:rPr>
+          <w:rFonts w:ascii="David" w:hAnsi="David" w:cs="David"/>
+        </w:rPr>
+        <w:t>16</w:t>
+      </w:r>
+      <w:r>
+        <w:rPr>
+          <w:rFonts w:ascii="David" w:hAnsi="David" w:cs="David"/>
+        </w:rPr>
+        <w:t xml:space="preserve">, </w:t>
+      </w:r>
+      <w:r>
+        <w:rPr>
+          <w:rFonts w:ascii="David" w:hAnsi="David" w:cs="David"/>
+        </w:rPr>
+        <w:t>18</w:t>
+      </w:r>
+      <w:r>
+        <w:rPr>
+          <w:rFonts w:ascii="David" w:hAnsi="David" w:cs="David"/>
+        </w:rPr>
+        <w:t xml:space="preserve">, </w:t>
+      </w:r>
+      <w:r>
+        <w:rPr>
+          <w:rFonts w:ascii="David" w:hAnsi="David" w:cs="David"/>
+        </w:rPr>
+        <w:t>20</w:t>
+      </w:r>
+      <w:r>
+        <w:rPr>
+          <w:rFonts w:ascii="David" w:hAnsi="David" w:cs="David"/>
+        </w:rPr>
+        <w:t xml:space="preserve">, </w:t>
+      </w:r>
+      <w:r>
+        <w:rPr>
+          <w:rFonts w:ascii="David" w:hAnsi="David" w:cs="David"/>
+        </w:rPr>
+        <w:t>22</w:t>
+      </w:r>
+      <w:r>
+        <w:rPr>
+          <w:rFonts w:ascii="David" w:hAnsi="David" w:cs="David"/>
+        </w:rPr>
+        <w:t xml:space="preserve">, </w:t>
+      </w:r>
+      <w:r>
+        <w:rPr>
+          <w:rFonts w:ascii="David" w:hAnsi="David" w:cs="David"/>
+        </w:rPr>
+        <w:t>23</w:t>
+      </w:r>
+      <w:r>
+        <w:rPr>
+          <w:rFonts w:ascii="David" w:hAnsi="David" w:cs="David"/>
+        </w:rPr>
+        <w:t xml:space="preserve">, </w:t>
+      </w:r>
+      <w:r>
+        <w:rPr>
+          <w:rFonts w:ascii="David" w:hAnsi="David" w:cs="David"/>
+        </w:rPr>
+        <w:t>24</w:t>
+      </w:r>
+      <w:r>
+        <w:rPr>
+          <w:rFonts w:ascii="David" w:hAnsi="David" w:cs="David"/>
+        </w:rPr>
+        <w:t xml:space="preserve">, </w:t>
+      </w:r>
+      <w:r>
+        <w:rPr>
+          <w:rFonts w:ascii="David" w:hAnsi="David" w:cs="David"/>
+        </w:rPr>
+        <w:t>27</w:t>
+      </w:r>
+      <w:r>
+        <w:rPr>
+          <w:rFonts w:ascii="David" w:hAnsi="David" w:cs="David"/>
+        </w:rPr>
+        <w:t xml:space="preserve">, </w:t>
+      </w:r>
+      <w:r>
+        <w:rPr>
+          <w:rFonts w:ascii="David" w:hAnsi="David" w:cs="David"/>
+        </w:rPr>
+        <w:t>31</w:t>
+      </w:r>
+      <w:r>
+        <w:rPr>
+          <w:rFonts w:ascii="David" w:hAnsi="David" w:cs="David"/>
+        </w:rPr>
+        <w:t xml:space="preserve">, </w:t>
+      </w:r>
+      <w:r>
+        <w:rPr>
+          <w:rFonts w:ascii="David" w:hAnsi="David" w:cs="David"/>
+        </w:rPr>
+        <w:t>40</w:t>
+      </w:r>
+      <w:r>
+        <w:rPr>
+          <w:rFonts w:ascii="David" w:hAnsi="David" w:cs="David"/>
+        </w:rPr>
+        <w:t xml:space="preserve">, </w:t>
+      </w:r>
+      <w:r>
+        <w:rPr>
+          <w:rFonts w:ascii="David" w:hAnsi="David" w:cs="David"/>
+        </w:rPr>
+        <w:t>44</w:t>
+      </w:r>
+      <w:r>
+        <w:rPr>
+          <w:rFonts w:ascii="David" w:hAnsi="David" w:cs="David"/>
+        </w:rPr>
+        <w:t xml:space="preserve">, </w:t>
+      </w:r>
+      <w:r>
+        <w:rPr>
+          <w:rFonts w:ascii="David" w:hAnsi="David" w:cs="David"/>
+        </w:rPr>
+        <w:t>55</w:t>
+      </w:r>
+      <w:r>
+        <w:rPr>
+          <w:rFonts w:ascii="David" w:hAnsi="David" w:cs="David"/>
+        </w:rPr>
+        <w:t xml:space="preserve">, </w:t>
+      </w:r>
+      <w:r>
+        <w:rPr>
+          <w:rFonts w:ascii="David" w:hAnsi="David" w:cs="David"/>
+        </w:rPr>
+        <w:t>63</w:t>
+      </w:r>
+      <w:r>
+        <w:rPr>
+          <w:rFonts w:ascii="David" w:hAnsi="David" w:cs="David"/>
+        </w:rPr>
+        <w:t xml:space="preserve">, </w:t>
+      </w:r>
+      <w:r>
+        <w:rPr>
+          <w:rFonts w:ascii="David" w:hAnsi="David" w:cs="David"/>
+        </w:rPr>
+        <w:t>77</w:t>
+      </w:r>
+      <w:r>
+        <w:rPr>
+          <w:rFonts w:ascii="David" w:hAnsi="David" w:cs="David"/>
+        </w:rPr>
+        <w:t xml:space="preserve">, </w:t>
+      </w:r>
+      <w:r>
+        <w:rPr>
+          <w:rFonts w:ascii="David" w:hAnsi="David" w:cs="David"/>
+        </w:rPr>
+        <w:t>81</w:t>
+      </w:r>
+      <w:r>
+        <w:rPr>
+          <w:rFonts w:ascii="David" w:hAnsi="David" w:cs="David"/>
+        </w:rPr>
+        <w:t>}</w:t>
+      </w:r>
+      <w:r>
+        <w:rPr>
+          <w:rFonts w:ascii="David" w:hAnsi="David" w:cs="David"/>
+        </w:rPr>
+        <w:t>.</w:t>
+      </w:r>
+    </w:p>
+    <w:p>
+      <w:pPr>
+        <w:bidi w:val="0"/>
+        <w:spacing w:after="0" w:line="360" w:lineRule="auto"/>
+        <w:ind w:left="720"/>
+        <w:rPr>
+          <w:rFonts w:ascii="David" w:hAnsi="David" w:cs="David"/>
+        </w:rPr>
+      </w:pPr>
+      <w:r>
+        <w:rPr>
+          <w:rFonts w:ascii="David" w:hAnsi="David" w:cs="David"/>
+          <w:b/>
+          <w:bCs/>
+        </w:rPr>
+        <w:t>Features:</w:t>
+      </w:r>
+    </w:p>
+    <w:p>
+      <w:pPr>
+        <w:pStyle w:val="ListParagraph"/>
+        <w:numPr>
+          <w:ilvl w:val="0"/>
+          <w:numId w:val="14"/>
+        </w:numPr>
+        <w:bidi w:val="0"/>
+        <w:spacing w:after="0" w:line="360" w:lineRule="auto"/>
+        <w:rPr>
+          <w:rFonts w:ascii="David" w:hAnsi="David" w:cs="David"/>
+        </w:rPr>
+      </w:pPr>
+      <w:r>
+        <w:rPr>
+          <w:rFonts w:ascii="David" w:hAnsi="David" w:cs="David"/>
+        </w:rPr>
+        <w:t>entry_speed – the speed of the car in the start of the turn.</w:t>
+      </w:r>
+    </w:p>
+    <w:p>
+      <w:pPr>
+        <w:pStyle w:val="ListParagraph"/>
+        <w:numPr>
+          <w:ilvl w:val="1"/>
+          <w:numId w:val="14"/>
+        </w:numPr>
+        <w:bidi w:val="0"/>
+        <w:spacing w:after="0" w:line="360" w:lineRule="auto"/>
+        <w:rPr>
+          <w:rFonts w:ascii="David" w:hAnsi="David" w:cs="David"/>
+        </w:rPr>
+      </w:pPr>
+      <w:r>
+        <w:rPr>
+          <w:rFonts w:ascii="David" w:hAnsi="David" w:cs="David"/>
+        </w:rPr>
+        <w:t>Units: km/h</w:t>
+      </w:r>
+    </w:p>
+    <w:p>
+      <w:pPr>
+        <w:pStyle w:val="ListParagraph"/>
+        <w:numPr>
+          <w:ilvl w:val="1"/>
+          <w:numId w:val="14"/>
+        </w:numPr>
+        <w:bidi w:val="0"/>
+        <w:spacing w:after="0" w:line="360" w:lineRule="auto"/>
+        <w:rPr>
+          <w:rFonts w:ascii="David" w:hAnsi="David" w:cs="David"/>
+        </w:rPr>
+      </w:pPr>
+      <w:r>
+        <w:rPr>
+          <w:rFonts w:ascii="David" w:hAnsi="David" w:cs="David"/>
+        </w:rPr>
+        <w:t>Possible value range: 0-400 km/h</w:t>
+      </w:r>
+    </w:p>
+    <w:p>
+      <w:pPr>
+        <w:pStyle w:val="ListParagraph"/>
+        <w:numPr>
+          <w:ilvl w:val="0"/>
+          <w:numId w:val="14"/>
+        </w:numPr>
+        <w:bidi w:val="0"/>
+        <w:spacing w:after="0" w:line="360" w:lineRule="auto"/>
+        <w:rPr>
+          <w:rFonts w:ascii="David" w:hAnsi="David" w:cs="David"/>
+        </w:rPr>
+      </w:pPr>
+      <w:r>
+        <w:rPr>
+          <w:rFonts w:ascii="David" w:hAnsi="David" w:cs="David"/>
+        </w:rPr>
+        <w:t>apex_speed – the minimal speed of the car during the turn.</w:t>
+      </w:r>
+    </w:p>
+    <w:p>
+      <w:pPr>
+        <w:pStyle w:val="ListParagraph"/>
+        <w:numPr>
+          <w:ilvl w:val="1"/>
+          <w:numId w:val="14"/>
+        </w:numPr>
+        <w:bidi w:val="0"/>
+        <w:spacing w:after="0" w:line="360" w:lineRule="auto"/>
+        <w:rPr>
+          <w:rFonts w:ascii="David" w:hAnsi="David" w:cs="David"/>
+        </w:rPr>
+      </w:pPr>
+      <w:r>
+        <w:rPr>
+          <w:rFonts w:ascii="David" w:hAnsi="David" w:cs="David"/>
+        </w:rPr>
+        <w:t>Units: km/h</w:t>
+      </w:r>
+    </w:p>
+    <w:p>
+      <w:pPr>
+        <w:pStyle w:val="ListParagraph"/>
+        <w:numPr>
+          <w:ilvl w:val="1"/>
+          <w:numId w:val="14"/>
+        </w:numPr>
+        <w:bidi w:val="0"/>
+        <w:spacing w:after="0" w:line="360" w:lineRule="auto"/>
+        <w:rPr>
+          <w:rFonts w:ascii="David" w:hAnsi="David" w:cs="David"/>
+        </w:rPr>
+      </w:pPr>
+      <w:r>
+        <w:rPr>
+          <w:rFonts w:ascii="David" w:hAnsi="David" w:cs="David"/>
+        </w:rPr>
+        <w:t>Possible value range: 0-400 km/h</w:t>
+      </w:r>
+    </w:p>
+    <w:p>
+      <w:pPr>
+        <w:pStyle w:val="ListParagraph"/>
+        <w:numPr>
+          <w:ilvl w:val="0"/>
+          <w:numId w:val="14"/>
+        </w:numPr>
+        <w:bidi w:val="0"/>
+        <w:spacing w:after="0" w:line="360" w:lineRule="auto"/>
+        <w:rPr>
+          <w:rFonts w:ascii="David" w:hAnsi="David" w:cs="David"/>
+        </w:rPr>
+      </w:pPr>
+      <w:r>
+        <w:rPr>
+          <w:rFonts w:ascii="David" w:hAnsi="David" w:cs="David"/>
+        </w:rPr>
+        <w:t xml:space="preserve">exit_speed – the speed of the car </w:t>
+      </w:r>
+      <w:r>
+        <w:rPr>
+          <w:rFonts w:ascii="David" w:hAnsi="David" w:cs="David"/>
+        </w:rPr>
+        <w:t>in</w:t>
+      </w:r>
+      <w:r>
+        <w:rPr>
+          <w:rFonts w:ascii="David" w:hAnsi="David" w:cs="David"/>
+        </w:rPr>
+        <w:t xml:space="preserve"> the end of the turn.</w:t>
+      </w:r>
+    </w:p>
+    <w:p>
+      <w:pPr>
+        <w:pStyle w:val="ListParagraph"/>
+        <w:numPr>
+          <w:ilvl w:val="1"/>
+          <w:numId w:val="14"/>
+        </w:numPr>
+        <w:bidi w:val="0"/>
+        <w:spacing w:after="0" w:line="360" w:lineRule="auto"/>
+        <w:rPr>
+          <w:rFonts w:ascii="David" w:hAnsi="David" w:cs="David"/>
+        </w:rPr>
+      </w:pPr>
+      <w:r>
+        <w:rPr>
+          <w:rFonts w:ascii="David" w:hAnsi="David" w:cs="David"/>
+        </w:rPr>
+        <w:t>Units: km/h</w:t>
+      </w:r>
+    </w:p>
+    <w:p>
+      <w:pPr>
+        <w:pStyle w:val="ListParagraph"/>
+        <w:numPr>
+          <w:ilvl w:val="1"/>
+          <w:numId w:val="14"/>
+        </w:numPr>
+        <w:bidi w:val="0"/>
+        <w:spacing w:after="0" w:line="360" w:lineRule="auto"/>
+        <w:rPr>
+          <w:rFonts w:ascii="David" w:hAnsi="David" w:cs="David"/>
+        </w:rPr>
+      </w:pPr>
+      <w:r>
+        <w:rPr>
+          <w:rFonts w:ascii="David" w:hAnsi="David" w:cs="David"/>
+        </w:rPr>
+        <w:lastRenderedPageBreak/>
+        <w:t>Possible value range: 0-400 km/h</w:t>
+      </w:r>
+    </w:p>
+    <w:p>
+      <w:pPr>
+        <w:pStyle w:val="ListParagraph"/>
+        <w:numPr>
+          <w:ilvl w:val="0"/>
+          <w:numId w:val="14"/>
+        </w:numPr>
+        <w:bidi w:val="0"/>
+        <w:spacing w:after="0" w:line="360" w:lineRule="auto"/>
+        <w:rPr>
+          <w:rFonts w:ascii="David" w:hAnsi="David" w:cs="David"/>
+        </w:rPr>
+      </w:pPr>
+      <w:r>
+        <w:rPr>
+          <w:rFonts w:ascii="David" w:hAnsi="David" w:cs="David"/>
+        </w:rPr>
+        <w:t>speed_drop – the difference between “entry_speed” to “apex_speed”.</w:t>
+      </w:r>
+    </w:p>
+    <w:p>
+      <w:pPr>
+        <w:pStyle w:val="ListParagraph"/>
+        <w:numPr>
+          <w:ilvl w:val="1"/>
+          <w:numId w:val="14"/>
+        </w:numPr>
+        <w:bidi w:val="0"/>
+        <w:spacing w:after="0" w:line="360" w:lineRule="auto"/>
+        <w:rPr>
+          <w:rFonts w:ascii="David" w:hAnsi="David" w:cs="David"/>
+        </w:rPr>
+      </w:pPr>
+      <w:r>
+        <w:rPr>
+          <w:rFonts w:ascii="David" w:hAnsi="David" w:cs="David"/>
+        </w:rPr>
+        <w:t>Units: km/h</w:t>
+      </w:r>
+    </w:p>
+    <w:p>
+      <w:pPr>
+        <w:pStyle w:val="ListParagraph"/>
+        <w:numPr>
+          <w:ilvl w:val="1"/>
+          <w:numId w:val="14"/>
+        </w:numPr>
+        <w:bidi w:val="0"/>
+        <w:spacing w:after="0" w:line="360" w:lineRule="auto"/>
+        <w:rPr>
+          <w:rFonts w:ascii="David" w:hAnsi="David" w:cs="David"/>
+        </w:rPr>
+      </w:pPr>
+      <w:r>
+        <w:rPr>
+          <w:rFonts w:ascii="David" w:hAnsi="David" w:cs="David"/>
+        </w:rPr>
+        <w:t>Possible value range: 0-400 km/h</w:t>
+      </w:r>
+      <w:r>
+        <w:rPr>
+          <w:rFonts w:ascii="David" w:hAnsi="David" w:cs="David"/>
+        </w:rPr>
+        <w:t>.</w:t>
+      </w:r>
+    </w:p>
+    <w:p>
+      <w:pPr>
+        <w:pStyle w:val="ListParagraph"/>
+        <w:numPr>
+          <w:ilvl w:val="0"/>
+          <w:numId w:val="14"/>
+        </w:numPr>
+        <w:bidi w:val="0"/>
+        <w:spacing w:after="0" w:line="360" w:lineRule="auto"/>
+        <w:rPr>
+          <w:rFonts w:ascii="David" w:hAnsi="David" w:cs="David"/>
+        </w:rPr>
+      </w:pPr>
+      <w:r>
+        <w:rPr>
+          <w:rFonts w:ascii="David" w:hAnsi="David" w:cs="David"/>
+        </w:rPr>
+        <w:t xml:space="preserve">braking_pct_before_apex – the precentage of the segment of the turn that is before the apex in which the driver presses on the brake pedal </w:t>
+      </w:r>
+    </w:p>
+    <w:p>
+      <w:pPr>
+        <w:pStyle w:val="ListParagraph"/>
+        <w:numPr>
+          <w:ilvl w:val="1"/>
+          <w:numId w:val="14"/>
+        </w:numPr>
+        <w:bidi w:val="0"/>
+        <w:spacing w:after="0" w:line="360" w:lineRule="auto"/>
+        <w:rPr>
+          <w:rFonts w:ascii="David" w:hAnsi="David" w:cs="David"/>
+        </w:rPr>
+      </w:pPr>
+      <w:r>
+        <w:rPr>
+          <w:rFonts w:ascii="David" w:hAnsi="David" w:cs="David"/>
+        </w:rPr>
+        <w:t>Units:</w:t>
+      </w:r>
+      <w:r>
+        <w:rPr>
+          <w:rFonts w:ascii="David" w:hAnsi="David" w:cs="David"/>
+        </w:rPr>
+        <w:t xml:space="preserve"> </w:t>
+      </w:r>
+      <w:r>
+        <w:rPr>
+          <w:rFonts w:ascii="David" w:hAnsi="David" w:cs="David"/>
+        </w:rPr>
+        <w:t>precentage</w:t>
+      </w:r>
+      <w:r>
+        <w:rPr>
+          <w:rFonts w:ascii="David" w:hAnsi="David" w:cs="David"/>
+        </w:rPr>
+        <w:t>.</w:t>
+      </w:r>
+    </w:p>
+    <w:p>
+      <w:pPr>
+        <w:pStyle w:val="ListParagraph"/>
+        <w:numPr>
+          <w:ilvl w:val="1"/>
+          <w:numId w:val="14"/>
+        </w:numPr>
+        <w:bidi w:val="0"/>
+        <w:spacing w:after="0" w:line="360" w:lineRule="auto"/>
+        <w:rPr>
+          <w:rFonts w:ascii="David" w:hAnsi="David" w:cs="David"/>
+        </w:rPr>
+      </w:pPr>
+      <w:r>
+        <w:rPr>
+          <w:rFonts w:ascii="David" w:hAnsi="David" w:cs="David"/>
+        </w:rPr>
+        <w:t>Possible value range: 0-1.</w:t>
+      </w:r>
+    </w:p>
+    <w:p>
+      <w:pPr>
+        <w:pStyle w:val="ListParagraph"/>
+        <w:numPr>
+          <w:ilvl w:val="0"/>
+          <w:numId w:val="14"/>
+        </w:numPr>
+        <w:bidi w:val="0"/>
+        <w:spacing w:after="0" w:line="360" w:lineRule="auto"/>
+        <w:rPr>
+          <w:rFonts w:ascii="David" w:hAnsi="David" w:cs="David"/>
+        </w:rPr>
+      </w:pPr>
+      <w:r>
+        <w:rPr>
+          <w:rFonts w:ascii="David" w:hAnsi="David" w:cs="David"/>
+        </w:rPr>
+        <w:t>trail_braking_pct</w:t>
+      </w:r>
+      <w:r>
+        <w:rPr>
+          <w:rFonts w:ascii="David" w:hAnsi="David" w:cs="David"/>
+        </w:rPr>
+        <w:t xml:space="preserve"> – the precentage of the turn in which the driver performed “trail breaking” (a slow release of the brake pedal).</w:t>
+      </w:r>
+    </w:p>
+    <w:p>
+      <w:pPr>
+        <w:pStyle w:val="ListParagraph"/>
+        <w:numPr>
+          <w:ilvl w:val="1"/>
+          <w:numId w:val="14"/>
+        </w:numPr>
+        <w:bidi w:val="0"/>
+        <w:spacing w:after="0" w:line="360" w:lineRule="auto"/>
+        <w:rPr>
+          <w:rFonts w:ascii="David" w:hAnsi="David" w:cs="David"/>
+        </w:rPr>
+      </w:pPr>
+      <w:r>
+        <w:rPr>
+          <w:rFonts w:ascii="David" w:hAnsi="David" w:cs="David"/>
+        </w:rPr>
+        <w:t xml:space="preserve">Units: </w:t>
+      </w:r>
+      <w:r>
+        <w:rPr>
+          <w:rFonts w:ascii="David" w:hAnsi="David" w:cs="David"/>
+        </w:rPr>
+        <w:t>precentage</w:t>
+      </w:r>
+      <w:r>
+        <w:rPr>
+          <w:rFonts w:ascii="David" w:hAnsi="David" w:cs="David"/>
+        </w:rPr>
+        <w:t>.</w:t>
+      </w:r>
+    </w:p>
+    <w:p>
+      <w:pPr>
+        <w:pStyle w:val="ListParagraph"/>
+        <w:numPr>
+          <w:ilvl w:val="1"/>
+          <w:numId w:val="14"/>
+        </w:numPr>
+        <w:bidi w:val="0"/>
+        <w:spacing w:after="0" w:line="360" w:lineRule="auto"/>
+        <w:rPr>
+          <w:rFonts w:ascii="David" w:hAnsi="David" w:cs="David"/>
+        </w:rPr>
+      </w:pPr>
+      <w:r>
+        <w:rPr>
+          <w:rFonts w:ascii="David" w:hAnsi="David" w:cs="David"/>
+        </w:rPr>
+        <w:t>Possible value range: 0-1.</w:t>
+      </w:r>
+    </w:p>
+    <w:p>
+      <w:pPr>
+        <w:pStyle w:val="ListParagraph"/>
+        <w:numPr>
+          <w:ilvl w:val="0"/>
+          <w:numId w:val="14"/>
+        </w:numPr>
+        <w:bidi w:val="0"/>
+        <w:spacing w:after="0" w:line="360" w:lineRule="auto"/>
+        <w:rPr>
+          <w:rFonts w:ascii="David" w:hAnsi="David" w:cs="David"/>
+        </w:rPr>
+      </w:pPr>
+      <w:r>
+        <w:rPr>
+          <w:rFonts w:ascii="David" w:hAnsi="David" w:cs="David"/>
+        </w:rPr>
+        <w:t xml:space="preserve">throttle_app_pct_after_apex – the precentage of the </w:t>
+      </w:r>
+      <w:r>
+        <w:rPr>
+          <w:rFonts w:ascii="David" w:hAnsi="David" w:cs="David"/>
+        </w:rPr>
+        <w:t>segment of the turn that is after the apex in which the driver presses on the throttle.</w:t>
+      </w:r>
+    </w:p>
+    <w:p>
+      <w:pPr>
+        <w:pStyle w:val="ListParagraph"/>
+        <w:numPr>
+          <w:ilvl w:val="1"/>
+          <w:numId w:val="14"/>
+        </w:numPr>
+        <w:bidi w:val="0"/>
+        <w:spacing w:after="0" w:line="360" w:lineRule="auto"/>
+        <w:rPr>
+          <w:rFonts w:ascii="David" w:hAnsi="David" w:cs="David"/>
+        </w:rPr>
+      </w:pPr>
+      <w:r>
+        <w:rPr>
+          <w:rFonts w:ascii="David" w:hAnsi="David" w:cs="David"/>
+        </w:rPr>
+        <w:t xml:space="preserve">Units: </w:t>
+      </w:r>
+      <w:r>
+        <w:rPr>
+          <w:rFonts w:ascii="David" w:hAnsi="David" w:cs="David"/>
+        </w:rPr>
+        <w:t>precentage</w:t>
+      </w:r>
+      <w:r>
+        <w:rPr>
+          <w:rFonts w:ascii="David" w:hAnsi="David" w:cs="David"/>
+        </w:rPr>
+        <w:t>.</w:t>
+      </w:r>
+    </w:p>
+    <w:p>
+      <w:pPr>
+        <w:pStyle w:val="ListParagraph"/>
+        <w:numPr>
+          <w:ilvl w:val="1"/>
+          <w:numId w:val="14"/>
+        </w:numPr>
+        <w:bidi w:val="0"/>
+        <w:spacing w:after="0" w:line="360" w:lineRule="auto"/>
+        <w:rPr>
+          <w:rFonts w:ascii="David" w:hAnsi="David" w:cs="David"/>
+        </w:rPr>
+      </w:pPr>
+      <w:r>
+        <w:rPr>
+          <w:rFonts w:ascii="David" w:hAnsi="David" w:cs="David"/>
+        </w:rPr>
+        <w:t>Possible value range: 0-1.</w:t>
+      </w:r>
+    </w:p>
+    <w:p>
+      <w:pPr>
+        <w:pStyle w:val="ListParagraph"/>
+        <w:numPr>
+          <w:ilvl w:val="0"/>
+          <w:numId w:val="14"/>
+        </w:numPr>
+        <w:bidi w:val="0"/>
+        <w:spacing w:after="0" w:line="360" w:lineRule="auto"/>
+        <w:rPr>
+          <w:rFonts w:ascii="David" w:hAnsi="David" w:cs="David"/>
+        </w:rPr>
+      </w:pPr>
+      <w:r>
+        <w:rPr>
+          <w:rFonts w:ascii="David" w:hAnsi="David" w:cs="David"/>
+        </w:rPr>
+        <w:t>coasting_pct – the precentage of the turn in which the driver didn’t press on the brake nor the throttle.</w:t>
+      </w:r>
+    </w:p>
+    <w:p>
+      <w:pPr>
+        <w:pStyle w:val="ListParagraph"/>
+        <w:numPr>
+          <w:ilvl w:val="1"/>
+          <w:numId w:val="14"/>
+        </w:numPr>
+        <w:bidi w:val="0"/>
+        <w:spacing w:after="0" w:line="360" w:lineRule="auto"/>
+        <w:rPr>
+          <w:rFonts w:ascii="David" w:hAnsi="David" w:cs="David"/>
+        </w:rPr>
+      </w:pPr>
+      <w:r>
+        <w:rPr>
+          <w:rFonts w:ascii="David" w:hAnsi="David" w:cs="David"/>
+        </w:rPr>
+        <w:t xml:space="preserve">Units: </w:t>
+      </w:r>
+      <w:r>
+        <w:rPr>
+          <w:rFonts w:ascii="David" w:hAnsi="David" w:cs="David"/>
+        </w:rPr>
+        <w:t>precentage</w:t>
+      </w:r>
+      <w:r>
+        <w:rPr>
+          <w:rFonts w:ascii="David" w:hAnsi="David" w:cs="David"/>
+        </w:rPr>
+        <w:t>.</w:t>
+      </w:r>
+    </w:p>
+    <w:p>
+      <w:pPr>
+        <w:pStyle w:val="ListParagraph"/>
+        <w:numPr>
+          <w:ilvl w:val="1"/>
+          <w:numId w:val="14"/>
+        </w:numPr>
+        <w:bidi w:val="0"/>
+        <w:spacing w:after="0" w:line="360" w:lineRule="auto"/>
+        <w:rPr>
+          <w:rFonts w:ascii="David" w:hAnsi="David" w:cs="David"/>
+        </w:rPr>
+      </w:pPr>
+      <w:r>
+        <w:rPr>
+          <w:rFonts w:ascii="David" w:hAnsi="David" w:cs="David"/>
+        </w:rPr>
+        <w:t>Possible value range: 0-1.</w:t>
+      </w:r>
+    </w:p>
+    <w:p>
+      <w:pPr>
+        <w:pStyle w:val="ListParagraph"/>
+        <w:numPr>
+          <w:ilvl w:val="0"/>
+          <w:numId w:val="14"/>
+        </w:numPr>
+        <w:bidi w:val="0"/>
+        <w:spacing w:after="0" w:line="360" w:lineRule="auto"/>
+        <w:rPr>
+          <w:rFonts w:ascii="David" w:hAnsi="David" w:cs="David"/>
+        </w:rPr>
+      </w:pPr>
+      <w:r>
+        <w:rPr>
+          <w:rFonts w:ascii="David" w:hAnsi="David" w:cs="David"/>
+        </w:rPr>
+        <w:t xml:space="preserve">breaking_time_pct – </w:t>
+      </w:r>
+      <w:r>
+        <w:rPr>
+          <w:rFonts w:ascii="David" w:hAnsi="David" w:cs="David"/>
+        </w:rPr>
+        <w:t>the precentage of the turn in which the driver pressed the brake pedal.</w:t>
+      </w:r>
+    </w:p>
+    <w:p>
+      <w:pPr>
+        <w:pStyle w:val="ListParagraph"/>
+        <w:numPr>
+          <w:ilvl w:val="1"/>
+          <w:numId w:val="14"/>
+        </w:numPr>
+        <w:bidi w:val="0"/>
+        <w:spacing w:after="0" w:line="360" w:lineRule="auto"/>
+        <w:rPr>
+          <w:rFonts w:ascii="David" w:hAnsi="David" w:cs="David"/>
+        </w:rPr>
+      </w:pPr>
+      <w:r>
+        <w:rPr>
+          <w:rFonts w:ascii="David" w:hAnsi="David" w:cs="David"/>
+        </w:rPr>
+        <w:t>Units: precentage.</w:t>
+      </w:r>
+    </w:p>
+    <w:p>
+      <w:pPr>
+        <w:pStyle w:val="ListParagraph"/>
+        <w:numPr>
+          <w:ilvl w:val="1"/>
+          <w:numId w:val="14"/>
+        </w:numPr>
+        <w:bidi w:val="0"/>
+        <w:spacing w:after="0" w:line="360" w:lineRule="auto"/>
+        <w:rPr>
+          <w:rFonts w:ascii="David" w:hAnsi="David" w:cs="David"/>
+        </w:rPr>
+      </w:pPr>
+      <w:r>
+        <w:rPr>
+          <w:rFonts w:ascii="David" w:hAnsi="David" w:cs="David"/>
+        </w:rPr>
+        <w:t>Possible value range: 0-1.</w:t>
+      </w:r>
+    </w:p>
+    <w:p>
+      <w:pPr>
+        <w:pStyle w:val="ListParagraph"/>
+        <w:numPr>
+          <w:ilvl w:val="0"/>
+          <w:numId w:val="14"/>
+        </w:numPr>
+        <w:bidi w:val="0"/>
+        <w:spacing w:after="0" w:line="360" w:lineRule="auto"/>
+        <w:rPr>
+          <w:rFonts w:ascii="David" w:hAnsi="David" w:cs="David"/>
+        </w:rPr>
+      </w:pPr>
+      <w:r>
+        <w:rPr>
+          <w:rFonts w:ascii="David" w:hAnsi="David" w:cs="David"/>
+        </w:rPr>
+        <w:t xml:space="preserve">min_gear </w:t>
+      </w:r>
+      <w:r>
+        <w:rPr>
+          <w:rFonts w:ascii="David" w:hAnsi="David" w:cs="David"/>
+        </w:rPr>
+        <w:t>–</w:t>
+      </w:r>
+      <w:r>
+        <w:rPr>
+          <w:rFonts w:ascii="David" w:hAnsi="David" w:cs="David"/>
+        </w:rPr>
+        <w:t xml:space="preserve"> </w:t>
+      </w:r>
+      <w:r>
+        <w:rPr>
+          <w:rFonts w:ascii="David" w:hAnsi="David" w:cs="David"/>
+        </w:rPr>
+        <w:t>the minimal gear that the car was on during the turn.</w:t>
+      </w:r>
+    </w:p>
+    <w:p>
+      <w:pPr>
+        <w:pStyle w:val="ListParagraph"/>
+        <w:numPr>
+          <w:ilvl w:val="1"/>
+          <w:numId w:val="14"/>
+        </w:numPr>
+        <w:bidi w:val="0"/>
+        <w:spacing w:after="0" w:line="360" w:lineRule="auto"/>
+        <w:rPr>
+          <w:rFonts w:ascii="David" w:hAnsi="David" w:cs="David"/>
+        </w:rPr>
+      </w:pPr>
+      <w:r>
+        <w:rPr>
+          <w:rFonts w:ascii="David" w:hAnsi="David" w:cs="David"/>
+        </w:rPr>
+        <w:t>Units: irrelevant</w:t>
+      </w:r>
+    </w:p>
+    <w:p>
+      <w:pPr>
+        <w:pStyle w:val="ListParagraph"/>
+        <w:numPr>
+          <w:ilvl w:val="1"/>
+          <w:numId w:val="14"/>
+        </w:numPr>
+        <w:bidi w:val="0"/>
+        <w:spacing w:after="0" w:line="360" w:lineRule="auto"/>
+        <w:rPr>
+          <w:rFonts w:ascii="David" w:hAnsi="David" w:cs="David"/>
+        </w:rPr>
+      </w:pPr>
+      <w:r>
+        <w:rPr>
+          <w:rFonts w:ascii="David" w:hAnsi="David" w:cs="David"/>
+        </w:rPr>
+        <w:t>Possible value range: 0-8</w:t>
+      </w:r>
+      <w:r>
+        <w:rPr>
+          <w:rFonts w:ascii="David" w:hAnsi="David" w:cs="David"/>
+        </w:rPr>
+        <w:t>.</w:t>
+      </w:r>
+    </w:p>
+    <w:p>
+      <w:pPr>
+        <w:pStyle w:val="ListParagraph"/>
+        <w:numPr>
+          <w:ilvl w:val="0"/>
+          <w:numId w:val="14"/>
+        </w:numPr>
+        <w:bidi w:val="0"/>
+        <w:spacing w:after="0" w:line="360" w:lineRule="auto"/>
+        <w:rPr>
+          <w:rFonts w:ascii="David" w:hAnsi="David" w:cs="David"/>
+        </w:rPr>
+      </w:pPr>
+      <w:r>
+        <w:rPr>
+          <w:rFonts w:ascii="David" w:hAnsi="David" w:cs="David"/>
+        </w:rPr>
+        <w:t xml:space="preserve">avg_throttle – </w:t>
+      </w:r>
+      <w:r>
+        <w:rPr>
+          <w:rFonts w:ascii="David" w:hAnsi="David" w:cs="David"/>
+        </w:rPr>
+        <w:t>The average percentage the throttle</w:t>
       </w:r>
       <w:r>
         <w:rPr>
           <w:rFonts w:ascii="David" w:hAnsi="David" w:cs="David" w:hint="cs"/>
+          <w:rtl/>
+        </w:rPr>
+        <w:t xml:space="preserve"> </w:t>
+      </w:r>
+      <w:r>
+        <w:rPr>
+          <w:rFonts w:ascii="David" w:hAnsi="David" w:cs="David"/>
+        </w:rPr>
+        <w:t>pedal</w:t>
+      </w:r>
+      <w:r>
+        <w:rPr>
+          <w:rFonts w:ascii="David" w:hAnsi="David" w:cs="David"/>
+        </w:rPr>
+        <w:t xml:space="preserve"> is pressed during the </w:t>
+      </w:r>
+      <w:r>
+        <w:rPr>
+          <w:rFonts w:ascii="David" w:hAnsi="David" w:cs="David"/>
+        </w:rPr>
+        <w:t>turn</w:t>
+      </w:r>
+      <w:r>
+        <w:rPr>
+          <w:rFonts w:ascii="David" w:hAnsi="David" w:cs="David"/>
+        </w:rPr>
+        <w:t>.</w:t>
+      </w:r>
+    </w:p>
+    <w:p>
+      <w:pPr>
+        <w:pStyle w:val="ListParagraph"/>
+        <w:numPr>
+          <w:ilvl w:val="1"/>
+          <w:numId w:val="14"/>
+        </w:numPr>
+        <w:bidi w:val="0"/>
+        <w:spacing w:after="0" w:line="360" w:lineRule="auto"/>
+        <w:rPr>
+          <w:rFonts w:ascii="David" w:hAnsi="David" w:cs="David"/>
+        </w:rPr>
+      </w:pPr>
+      <w:r>
+        <w:rPr>
+          <w:rFonts w:ascii="David" w:hAnsi="David" w:cs="David"/>
+        </w:rPr>
+        <w:t>Units: precentage.</w:t>
+      </w:r>
+    </w:p>
+    <w:p>
+      <w:pPr>
+        <w:pStyle w:val="ListParagraph"/>
+        <w:numPr>
+          <w:ilvl w:val="1"/>
+          <w:numId w:val="14"/>
+        </w:numPr>
+        <w:bidi w:val="0"/>
+        <w:spacing w:after="0" w:line="360" w:lineRule="auto"/>
+        <w:rPr>
+          <w:rFonts w:ascii="David" w:hAnsi="David" w:cs="David"/>
+        </w:rPr>
+      </w:pPr>
+      <w:r>
+        <w:rPr>
+          <w:rFonts w:ascii="David" w:hAnsi="David" w:cs="David"/>
+        </w:rPr>
+        <w:t>Possible value range: 0-1</w:t>
+      </w:r>
+      <w:r>
+        <w:rPr>
+          <w:rFonts w:ascii="David" w:hAnsi="David" w:cs="David"/>
+        </w:rPr>
+        <w:t>00</w:t>
+      </w:r>
+      <w:r>
+        <w:rPr>
+          <w:rFonts w:ascii="David" w:hAnsi="David" w:cs="David"/>
+        </w:rPr>
+        <w:t>.</w:t>
+      </w:r>
+    </w:p>
+    <w:p>
+      <w:pPr>
+        <w:pStyle w:val="ListParagraph"/>
+        <w:numPr>
+          <w:ilvl w:val="0"/>
+          <w:numId w:val="14"/>
+        </w:numPr>
+        <w:bidi w:val="0"/>
+        <w:spacing w:after="0" w:line="360" w:lineRule="auto"/>
+        <w:rPr>
+          <w:rFonts w:ascii="David" w:hAnsi="David" w:cs="David"/>
+        </w:rPr>
+      </w:pPr>
+      <w:r>
+        <w:rPr>
+          <w:rFonts w:ascii="David" w:hAnsi="David" w:cs="David"/>
+        </w:rPr>
+        <w:t>avg_speed – The average speed of the car during the turn.</w:t>
+      </w:r>
+    </w:p>
+    <w:p>
+      <w:pPr>
+        <w:pStyle w:val="ListParagraph"/>
+        <w:numPr>
+          <w:ilvl w:val="1"/>
+          <w:numId w:val="14"/>
+        </w:numPr>
+        <w:bidi w:val="0"/>
+        <w:spacing w:after="0" w:line="360" w:lineRule="auto"/>
+        <w:rPr>
+          <w:rFonts w:ascii="David" w:hAnsi="David" w:cs="David"/>
+        </w:rPr>
+      </w:pPr>
+      <w:r>
+        <w:rPr>
+          <w:rFonts w:ascii="David" w:hAnsi="David" w:cs="David"/>
+        </w:rPr>
+        <w:t>Units: km/h</w:t>
+      </w:r>
+    </w:p>
+    <w:p>
+      <w:pPr>
+        <w:pStyle w:val="ListParagraph"/>
+        <w:numPr>
+          <w:ilvl w:val="1"/>
+          <w:numId w:val="14"/>
+        </w:numPr>
+        <w:bidi w:val="0"/>
+        <w:spacing w:after="0" w:line="360" w:lineRule="auto"/>
+        <w:rPr>
+          <w:rFonts w:ascii="David" w:hAnsi="David" w:cs="David"/>
+        </w:rPr>
+      </w:pPr>
+      <w:r>
+        <w:rPr>
+          <w:rFonts w:ascii="David" w:hAnsi="David" w:cs="David"/>
+        </w:rPr>
+        <w:t>Possible value range – 0-400</w:t>
+      </w:r>
+      <w:r>
+        <w:rPr>
+          <w:rFonts w:ascii="David" w:hAnsi="David" w:cs="David"/>
+        </w:rPr>
+        <w:t xml:space="preserve"> km/h</w:t>
+      </w:r>
+      <w:r>
+        <w:rPr>
+          <w:rFonts w:ascii="David" w:hAnsi="David" w:cs="David"/>
+        </w:rPr>
+        <w:t>.</w:t>
+      </w:r>
+    </w:p>
+    <w:p>
+      <w:pPr>
+        <w:bidi w:val="0"/>
+        <w:spacing w:after="0" w:line="360" w:lineRule="auto"/>
+        <w:rPr>
+          <w:rFonts w:ascii="David" w:hAnsi="David" w:cs="David"/>
+          <w:b/>
+          <w:bCs/>
+        </w:rPr>
+      </w:pPr>
+    </w:p>
+    <w:p>
+      <w:pPr>
+        <w:bidi w:val="0"/>
+        <w:spacing w:after="0" w:line="360" w:lineRule="auto"/>
+        <w:rPr>
+          <w:rFonts w:ascii="David" w:hAnsi="David" w:cs="David"/>
+          <w:b/>
+          <w:bCs/>
+        </w:rPr>
+      </w:pPr>
+      <w:r>
+        <w:rPr>
+          <w:rFonts w:ascii="David" w:hAnsi="David" w:cs="David"/>
+          <w:b/>
+          <w:bCs/>
+        </w:rPr>
+        <w:t>Difference in feature scale:</w:t>
+      </w:r>
+    </w:p>
+    <w:p>
+      <w:pPr>
+        <w:bidi w:val="0"/>
+        <w:spacing w:after="0" w:line="360" w:lineRule="auto"/>
+        <w:rPr>
+          <w:rFonts w:ascii="David" w:hAnsi="David" w:cs="David"/>
+        </w:rPr>
+      </w:pPr>
+      <w:r>
+        <w:rPr>
+          <w:rFonts w:ascii="David" w:hAnsi="David" w:cs="David"/>
+        </w:rPr>
+        <w:t>We must notice there is a big difference in scale between the features that are speed-based, which are measured in km/h and are between 0-400, and the features that are braking/throttle-based, which are measured in precentages between 0-1. There will be a process of normalization of the features to the 0-1 range, in order to make sure that no feature has dramatic influence over the outcome of the clustering process.</w:t>
+      </w:r>
+    </w:p>
+    <w:p>
+      <w:pPr>
+        <w:bidi w:val="0"/>
+        <w:spacing w:after="0" w:line="360" w:lineRule="auto"/>
+        <w:rPr>
+          <w:rFonts w:ascii="David" w:hAnsi="David" w:cs="David"/>
+          <w:b/>
+          <w:bCs/>
+        </w:rPr>
+      </w:pPr>
+    </w:p>
+    <w:p>
+      <w:pPr>
+        <w:bidi w:val="0"/>
+        <w:spacing w:after="0" w:line="360" w:lineRule="auto"/>
+        <w:rPr>
+          <w:rFonts w:ascii="David" w:hAnsi="David" w:cs="David"/>
           <w:b/>
           <w:bCs/>
           <w:rtl/>
         </w:rPr>
-        <w:t>:</w:t>
-      </w:r>
-      <w:r>
-        <w:rPr>
-          <w:rFonts w:ascii="David" w:hAnsi="David" w:cs="David" w:hint="cs"/>
-          <w:rtl/>
-        </w:rPr>
-        <w:t xml:space="preserve"> </w:t>
-      </w:r>
-      <w:r>
-        <w:rPr>
-          <w:rFonts w:ascii="David" w:hAnsi="David" w:cs="David" w:hint="cs"/>
-        </w:rPr>
-        <w:t>F1 Driver Cornering Telemetry (Custom Built Dataset)</w:t>
-      </w:r>
-    </w:p>
-    <w:p>
-      <w:pPr>
-        <w:pStyle w:val="ListParagraph"/>
-        <w:numPr>
-          <w:ilvl w:val="0"/>
-          <w:numId w:val="10"/>
-        </w:numPr>
-        <w:spacing w:after="0" w:line="360" w:lineRule="auto"/>
-        <w:rPr>
-          <w:rFonts w:ascii="David" w:hAnsi="David" w:cs="David"/>
-        </w:rPr>
-      </w:pPr>
-      <w:r>
-        <w:rPr>
-          <w:rFonts w:ascii="David" w:hAnsi="David" w:cs="David" w:hint="cs"/>
+      </w:pPr>
+    </w:p>
+    <w:p>
+      <w:pPr>
+        <w:bidi w:val="0"/>
+        <w:spacing w:after="0" w:line="360" w:lineRule="auto"/>
+        <w:rPr>
+          <w:rFonts w:ascii="David" w:hAnsi="David" w:cs="David"/>
           <w:b/>
           <w:bCs/>
           <w:rtl/>
         </w:rPr>
-        <w:t>מקור הנתונים:</w:t>
-      </w:r>
-      <w:r>
-        <w:rPr>
-          <w:rFonts w:ascii="David" w:hAnsi="David" w:cs="David" w:hint="cs"/>
-          <w:rtl/>
-        </w:rPr>
-        <w:t xml:space="preserve"> </w:t>
-      </w:r>
-      <w:r>
-        <w:rPr>
-          <w:rFonts w:ascii="David" w:hAnsi="David" w:cs="David" w:hint="cs"/>
-          <w:rtl/>
-        </w:rPr>
-        <w:t>חולץ באמצעות ה</w:t>
-      </w:r>
-      <w:r>
-        <w:rPr>
-          <w:rFonts w:ascii="David" w:hAnsi="David" w:cs="David" w:hint="cs"/>
-        </w:rPr>
-        <w:t xml:space="preserve">-API </w:t>
-      </w:r>
-      <w:r>
-        <w:rPr>
-          <w:rFonts w:ascii="David" w:hAnsi="David" w:cs="David" w:hint="cs"/>
-          <w:rtl/>
-        </w:rPr>
-        <w:t>של</w:t>
-      </w:r>
-      <w:r>
-        <w:rPr>
-          <w:rFonts w:ascii="David" w:hAnsi="David" w:cs="David" w:hint="cs"/>
-        </w:rPr>
-        <w:t xml:space="preserve"> OpenF1 </w:t>
-      </w:r>
-      <w:r>
-        <w:rPr>
-          <w:rFonts w:ascii="David" w:hAnsi="David" w:cs="David" w:hint="cs"/>
-          <w:rtl/>
-        </w:rPr>
-        <w:t>נתוני טלמטריה חיים של רכבי פורמולה 1</w:t>
-      </w:r>
-      <w:r>
-        <w:rPr>
-          <w:rFonts w:ascii="David" w:hAnsi="David" w:cs="David" w:hint="cs"/>
-          <w:rtl/>
-        </w:rPr>
-        <w:t xml:space="preserve"> מ</w:t>
-      </w:r>
-      <w:r>
-        <w:rPr>
-          <w:rFonts w:ascii="David" w:hAnsi="David" w:cs="David" w:hint="cs"/>
-          <w:rtl/>
-        </w:rPr>
-        <w:t xml:space="preserve">-4 </w:t>
-      </w:r>
-      <w:r>
-        <w:rPr>
-          <w:rFonts w:ascii="David" w:hAnsi="David" w:cs="David" w:hint="cs"/>
-          <w:rtl/>
-        </w:rPr>
-        <w:t>מירוצים רשמיים</w:t>
-      </w:r>
-      <w:r>
-        <w:rPr>
-          <w:rFonts w:ascii="David" w:hAnsi="David" w:cs="David" w:hint="cs"/>
-          <w:rtl/>
-        </w:rPr>
-        <w:t xml:space="preserve"> שהתקיימו בשנת 2023 </w:t>
-      </w:r>
-      <w:r>
-        <w:rPr>
-          <w:rFonts w:ascii="David" w:hAnsi="David" w:cs="David"/>
-          <w:rtl/>
-        </w:rPr>
-        <w:t>–</w:t>
-      </w:r>
-      <w:r>
-        <w:rPr>
-          <w:rFonts w:ascii="David" w:hAnsi="David" w:cs="David" w:hint="cs"/>
-          <w:rtl/>
-        </w:rPr>
-        <w:t xml:space="preserve"> </w:t>
-      </w:r>
-      <w:r>
-        <w:rPr>
-          <w:rFonts w:ascii="David" w:hAnsi="David" w:cs="David"/>
-        </w:rPr>
-        <w:t>Monza, Singapore, Spa, Suzuka</w:t>
-      </w:r>
-      <w:r>
-        <w:rPr>
-          <w:rFonts w:ascii="David" w:hAnsi="David" w:cs="David" w:hint="cs"/>
-          <w:rtl/>
-        </w:rPr>
-        <w:t>.</w:t>
-      </w:r>
-    </w:p>
-    <w:p>
-      <w:pPr>
-        <w:pStyle w:val="ListParagraph"/>
-        <w:numPr>
-          <w:ilvl w:val="0"/>
-          <w:numId w:val="10"/>
-        </w:numPr>
-        <w:spacing w:after="0" w:line="360" w:lineRule="auto"/>
-        <w:rPr>
-          <w:rFonts w:ascii="David" w:hAnsi="David" w:cs="David"/>
-        </w:rPr>
-      </w:pPr>
-      <w:r>
-        <w:rPr>
-          <w:rFonts w:ascii="David" w:hAnsi="David" w:cs="David" w:hint="cs"/>
+      </w:pPr>
+    </w:p>
+    <w:p>
+      <w:pPr>
+        <w:bidi w:val="0"/>
+        <w:spacing w:after="0" w:line="360" w:lineRule="auto"/>
+        <w:rPr>
+          <w:rFonts w:ascii="David" w:hAnsi="David" w:cs="David"/>
+        </w:rPr>
+      </w:pPr>
+      <w:r>
+        <w:rPr>
+          <w:rFonts w:ascii="David" w:hAnsi="David" w:cs="David"/>
           <w:b/>
           <w:bCs/>
+        </w:rPr>
+        <w:lastRenderedPageBreak/>
+        <w:t>Missing Values:</w:t>
+      </w:r>
+    </w:p>
+    <w:p>
+      <w:pPr>
+        <w:pStyle w:val="ListParagraph"/>
+        <w:numPr>
+          <w:ilvl w:val="0"/>
+          <w:numId w:val="13"/>
+        </w:numPr>
+        <w:bidi w:val="0"/>
+        <w:spacing w:after="0" w:line="360" w:lineRule="auto"/>
+        <w:rPr>
+          <w:rFonts w:ascii="David" w:hAnsi="David" w:cs="David"/>
+        </w:rPr>
+      </w:pPr>
+      <w:r>
+        <w:rPr>
+          <w:rFonts w:ascii="David" w:hAnsi="David" w:cs="David"/>
+        </w:rPr>
+        <w:t>There are 0.</w:t>
+      </w:r>
+      <w:r>
+        <w:rPr>
+          <w:rFonts w:ascii="David" w:hAnsi="David" w:cs="David"/>
+        </w:rPr>
+        <w:t>25 seconds between samples, in which, assuming the driver drives at an average of 200 km/h, the driver covers around 15 meters, that can be vital to learning his behavior during a turn.</w:t>
+      </w:r>
+    </w:p>
+    <w:p>
+      <w:pPr>
+        <w:pStyle w:val="ListParagraph"/>
+        <w:numPr>
+          <w:ilvl w:val="0"/>
+          <w:numId w:val="13"/>
+        </w:numPr>
+        <w:bidi w:val="0"/>
+        <w:spacing w:after="0" w:line="360" w:lineRule="auto"/>
+        <w:rPr>
+          <w:rFonts w:ascii="David" w:hAnsi="David" w:cs="David"/>
+        </w:rPr>
+      </w:pPr>
+      <w:r>
+        <w:rPr>
+          <w:rFonts w:ascii="David" w:hAnsi="David" w:cs="David"/>
+        </w:rPr>
+        <w:t>In the start and end point of each lap there is a gap of a few seconds in which the sensors of the cars stop producing new data. This gap can register as a turn when using our calculations</w:t>
+      </w:r>
+      <w:r>
+        <w:rPr>
+          <w:rFonts w:ascii="David" w:hAnsi="David" w:cs="David"/>
+        </w:rPr>
+        <w:t>, that relay on the change in location of the driver</w:t>
+      </w:r>
+      <w:r>
+        <w:rPr>
+          <w:rFonts w:ascii="David" w:hAnsi="David" w:cs="David"/>
+        </w:rPr>
+        <w:t>, thus generating noise that can affect the clustering.</w:t>
+      </w:r>
+    </w:p>
+    <w:p>
+      <w:pPr>
+        <w:bidi w:val="0"/>
+        <w:spacing w:after="0" w:line="360" w:lineRule="auto"/>
+        <w:ind w:left="360"/>
+        <w:rPr>
+          <w:rFonts w:ascii="David" w:hAnsi="David" w:cs="David"/>
           <w:rtl/>
-        </w:rPr>
-        <w:t>מספר דגימות:</w:t>
-      </w:r>
-      <w:r>
-        <w:rPr>
-          <w:rFonts w:ascii="David" w:hAnsi="David" w:cs="David" w:hint="cs"/>
-          <w:rtl/>
-        </w:rPr>
-        <w:t xml:space="preserve"> _____ דגימות</w:t>
-      </w:r>
-    </w:p>
-    <w:p>
-      <w:pPr>
-        <w:pStyle w:val="ListParagraph"/>
-        <w:numPr>
-          <w:ilvl w:val="0"/>
-          <w:numId w:val="10"/>
-        </w:numPr>
-        <w:spacing w:after="0" w:line="360" w:lineRule="auto"/>
-        <w:rPr>
-          <w:rFonts w:ascii="David" w:hAnsi="David" w:cs="David"/>
-        </w:rPr>
-      </w:pPr>
-      <w:r>
-        <w:rPr>
-          <w:rFonts w:ascii="David" w:hAnsi="David" w:cs="David" w:hint="cs"/>
-          <w:b/>
-          <w:bCs/>
-          <w:rtl/>
-        </w:rPr>
-        <w:t xml:space="preserve">מספר מאפיינים: </w:t>
-      </w:r>
-      <w:r>
-        <w:rPr>
-          <w:rFonts w:ascii="David" w:hAnsi="David" w:cs="David" w:hint="cs"/>
-          <w:rtl/>
-        </w:rPr>
-        <w:t>11</w:t>
-      </w:r>
-    </w:p>
-    <w:p>
-      <w:pPr>
-        <w:pStyle w:val="ListParagraph"/>
-        <w:numPr>
-          <w:ilvl w:val="0"/>
-          <w:numId w:val="10"/>
-        </w:numPr>
-        <w:spacing w:after="0" w:line="360" w:lineRule="auto"/>
-        <w:rPr>
-          <w:rFonts w:ascii="David" w:hAnsi="David" w:cs="David"/>
-        </w:rPr>
-      </w:pPr>
-      <w:r>
-        <w:rPr>
-          <w:rFonts w:ascii="David" w:hAnsi="David" w:cs="David" w:hint="cs"/>
-          <w:b/>
-          <w:bCs/>
-          <w:rtl/>
-        </w:rPr>
-        <w:t>מקור הנתונים:</w:t>
-      </w:r>
-      <w:r>
-        <w:rPr>
-          <w:rFonts w:ascii="David" w:hAnsi="David" w:cs="David" w:hint="cs"/>
-          <w:rtl/>
-        </w:rPr>
-        <w:t xml:space="preserve"> מדידות של חיישנים שנמצאים על רכבי פורמולה 1 במירוצים רשמיים.</w:t>
-      </w:r>
-    </w:p>
-    <w:p>
-      <w:pPr>
-        <w:spacing w:after="0" w:line="360" w:lineRule="auto"/>
-        <w:rPr>
-          <w:rFonts w:ascii="David" w:hAnsi="David" w:cs="David"/>
-          <w:rtl/>
-        </w:rPr>
-      </w:pPr>
-    </w:p>
-    <w:p>
-      <w:pPr>
-        <w:pBdr>
-          <w:bottom w:val="single" w:sz="6" w:space="1" w:color="auto"/>
-        </w:pBdr>
-        <w:spacing w:after="0" w:line="360" w:lineRule="auto"/>
-        <w:rPr>
-          <w:rFonts w:ascii="David" w:hAnsi="David" w:cs="David"/>
-          <w:b/>
-          <w:bCs/>
-          <w:sz w:val="32"/>
-          <w:szCs w:val="32"/>
-          <w:rtl/>
-        </w:rPr>
-      </w:pPr>
-      <w:r>
-        <w:rPr>
-          <w:rFonts w:ascii="David" w:hAnsi="David" w:cs="David" w:hint="cs"/>
-          <w:b/>
-          <w:bCs/>
-          <w:sz w:val="32"/>
-          <w:szCs w:val="32"/>
-          <w:rtl/>
-        </w:rPr>
-        <w:t>הבנת המאפיינים:</w:t>
-      </w:r>
-    </w:p>
-    <w:p>
-      <w:pPr>
-        <w:spacing w:after="0" w:line="360" w:lineRule="auto"/>
-        <w:rPr>
-          <w:rFonts w:ascii="David" w:hAnsi="David" w:cs="David"/>
-          <w:b/>
-          <w:bCs/>
-          <w:rtl/>
-        </w:rPr>
-      </w:pPr>
-    </w:p>
-    <w:p>
-      <w:pPr>
-        <w:spacing w:after="0" w:line="360" w:lineRule="auto"/>
-        <w:rPr>
-          <w:rFonts w:ascii="David" w:hAnsi="David" w:cs="David"/>
-          <w:rtl/>
-        </w:rPr>
-      </w:pPr>
-      <w:r>
-        <w:rPr>
-          <w:rFonts w:ascii="David" w:hAnsi="David" w:cs="David" w:hint="cs"/>
-          <w:b/>
-          <w:bCs/>
-          <w:rtl/>
-        </w:rPr>
-        <w:t>שורות ה-</w:t>
-      </w:r>
-      <w:r>
-        <w:rPr>
-          <w:rFonts w:ascii="David" w:hAnsi="David" w:cs="David"/>
-          <w:b/>
-          <w:bCs/>
-        </w:rPr>
-        <w:t>Dataset</w:t>
-      </w:r>
-      <w:r>
-        <w:rPr>
-          <w:rFonts w:ascii="David" w:hAnsi="David" w:cs="David" w:hint="cs"/>
-          <w:b/>
-          <w:bCs/>
-          <w:rtl/>
-        </w:rPr>
-        <w:t>:</w:t>
-      </w:r>
-      <w:r>
-        <w:rPr>
-          <w:rFonts w:ascii="David" w:hAnsi="David" w:cs="David" w:hint="cs"/>
-          <w:rtl/>
-        </w:rPr>
-        <w:t xml:space="preserve"> כל שורה ב-</w:t>
-      </w:r>
-      <w:r>
-        <w:rPr>
-          <w:rFonts w:ascii="David" w:hAnsi="David" w:cs="David"/>
-        </w:rPr>
-        <w:t>Dataset</w:t>
-      </w:r>
-      <w:r>
-        <w:rPr>
-          <w:rFonts w:ascii="David" w:hAnsi="David" w:cs="David" w:hint="cs"/>
-          <w:rtl/>
-        </w:rPr>
-        <w:t xml:space="preserve"> </w:t>
-      </w:r>
-      <w:r>
-        <w:rPr>
-          <w:rFonts w:ascii="David" w:hAnsi="David" w:cs="David" w:hint="cs"/>
-          <w:rtl/>
-        </w:rPr>
-        <w:t>מציינת פנייה שעושה אחד הנהגים במהלך נסיעה במסלול מירוצים.</w:t>
-      </w:r>
-    </w:p>
-    <w:p>
-      <w:pPr>
-        <w:spacing w:after="0" w:line="360" w:lineRule="auto"/>
-        <w:rPr>
-          <w:rFonts w:ascii="David" w:hAnsi="David" w:cs="David"/>
-          <w:b/>
-          <w:bCs/>
-          <w:rtl/>
-        </w:rPr>
-      </w:pPr>
-      <w:r>
-        <w:rPr>
-          <w:rFonts w:ascii="David" w:hAnsi="David" w:cs="David" w:hint="cs"/>
-          <w:b/>
-          <w:bCs/>
-          <w:rtl/>
-        </w:rPr>
-        <w:t>עמודות ה-</w:t>
-      </w:r>
-      <w:r>
-        <w:rPr>
-          <w:rFonts w:ascii="David" w:hAnsi="David" w:cs="David"/>
-          <w:b/>
-          <w:bCs/>
-        </w:rPr>
-        <w:t>Dataset</w:t>
-      </w:r>
-      <w:r>
-        <w:rPr>
-          <w:rFonts w:ascii="David" w:hAnsi="David" w:cs="David" w:hint="cs"/>
-          <w:b/>
-          <w:bCs/>
-          <w:rtl/>
-        </w:rPr>
-        <w:t>:</w:t>
-      </w:r>
-    </w:p>
-    <w:p>
-      <w:pPr>
-        <w:pStyle w:val="ListParagraph"/>
-        <w:numPr>
-          <w:ilvl w:val="0"/>
-          <w:numId w:val="12"/>
-        </w:numPr>
-        <w:spacing w:after="0" w:line="360" w:lineRule="auto"/>
-        <w:rPr>
-          <w:rFonts w:ascii="David" w:hAnsi="David" w:cs="David"/>
-          <w:b/>
-          <w:bCs/>
-        </w:rPr>
-      </w:pPr>
-      <w:r>
-        <w:rPr>
-          <w:rFonts w:ascii="David" w:hAnsi="David" w:cs="David"/>
-        </w:rPr>
-        <w:t>start_time</w:t>
-      </w:r>
-      <w:r>
-        <w:rPr>
-          <w:rFonts w:ascii="David" w:hAnsi="David" w:cs="David" w:hint="cs"/>
-          <w:rtl/>
-        </w:rPr>
-        <w:t xml:space="preserve"> </w:t>
-      </w:r>
-      <w:r>
-        <w:rPr>
-          <w:rFonts w:ascii="David" w:hAnsi="David" w:cs="David"/>
-          <w:rtl/>
-        </w:rPr>
-        <w:t>–</w:t>
-      </w:r>
-      <w:r>
-        <w:rPr>
-          <w:rFonts w:ascii="David" w:hAnsi="David" w:cs="David" w:hint="cs"/>
-          <w:rtl/>
-        </w:rPr>
-        <w:t xml:space="preserve"> זמן תחילת הפנייה. </w:t>
-      </w:r>
-    </w:p>
-    <w:p>
-      <w:pPr>
-        <w:pStyle w:val="ListParagraph"/>
-        <w:numPr>
-          <w:ilvl w:val="1"/>
-          <w:numId w:val="12"/>
-        </w:numPr>
-        <w:spacing w:after="0" w:line="360" w:lineRule="auto"/>
-        <w:rPr>
-          <w:rFonts w:ascii="David" w:hAnsi="David" w:cs="David"/>
-          <w:b/>
-          <w:bCs/>
-        </w:rPr>
-      </w:pPr>
-      <w:r>
-        <w:rPr>
-          <w:rFonts w:ascii="David" w:hAnsi="David" w:cs="David" w:hint="cs"/>
-          <w:rtl/>
-        </w:rPr>
-        <w:t xml:space="preserve">יחידות מידה - פורמט שעה </w:t>
-      </w:r>
-      <w:r>
-        <w:rPr>
-          <w:rFonts w:ascii="David" w:hAnsi="David" w:cs="David"/>
-        </w:rPr>
-        <w:t>yyyy-MM-dd'T'HH:mm:ss.SSS</w:t>
-      </w:r>
-      <w:r>
-        <w:rPr>
-          <w:rFonts w:ascii="David" w:hAnsi="David" w:cs="David"/>
-        </w:rPr>
-        <w:t>SSS+00:00</w:t>
-      </w:r>
-      <w:r>
-        <w:rPr>
-          <w:rFonts w:ascii="David" w:hAnsi="David" w:cs="David" w:hint="cs"/>
-          <w:rtl/>
-        </w:rPr>
-        <w:t xml:space="preserve">. </w:t>
-      </w:r>
-    </w:p>
-    <w:p>
-      <w:pPr>
-        <w:pStyle w:val="ListParagraph"/>
-        <w:numPr>
-          <w:ilvl w:val="1"/>
-          <w:numId w:val="12"/>
-        </w:numPr>
-        <w:spacing w:after="0" w:line="360" w:lineRule="auto"/>
-        <w:rPr>
-          <w:rFonts w:ascii="David" w:hAnsi="David" w:cs="David"/>
-          <w:b/>
-          <w:bCs/>
-        </w:rPr>
-      </w:pPr>
-      <w:r>
-        <w:rPr>
-          <w:rFonts w:ascii="David" w:hAnsi="David" w:cs="David" w:hint="cs"/>
-          <w:rtl/>
-        </w:rPr>
-        <w:t xml:space="preserve">טווח ערכים אפשרי </w:t>
-      </w:r>
-      <w:r>
-        <w:rPr>
-          <w:rFonts w:ascii="David" w:hAnsi="David" w:cs="David"/>
-          <w:rtl/>
-        </w:rPr>
-        <w:t>–</w:t>
-      </w:r>
-      <w:r>
-        <w:rPr>
-          <w:rFonts w:ascii="David" w:hAnsi="David" w:cs="David" w:hint="cs"/>
-          <w:rtl/>
-        </w:rPr>
-        <w:t xml:space="preserve"> </w:t>
-      </w:r>
-      <w:r>
-        <w:rPr>
-          <w:rFonts w:ascii="David" w:hAnsi="David" w:cs="David"/>
-        </w:rPr>
-        <w:t>2023-01-01T00:00:00:000000+00:00 – 2025-01-01T00:00:00:000000+00:00</w:t>
-      </w:r>
-    </w:p>
-    <w:p>
-      <w:pPr>
-        <w:pStyle w:val="ListParagraph"/>
-        <w:numPr>
-          <w:ilvl w:val="0"/>
-          <w:numId w:val="12"/>
-        </w:numPr>
-        <w:spacing w:after="0" w:line="360" w:lineRule="auto"/>
-        <w:rPr>
-          <w:rFonts w:ascii="David" w:hAnsi="David" w:cs="David"/>
-          <w:b/>
-          <w:bCs/>
-        </w:rPr>
-      </w:pPr>
-      <w:r>
-        <w:rPr>
-          <w:rFonts w:ascii="David" w:hAnsi="David" w:cs="David"/>
-        </w:rPr>
-        <w:t>entry_speed</w:t>
-      </w:r>
-      <w:r>
-        <w:rPr>
-          <w:rFonts w:ascii="David" w:hAnsi="David" w:cs="David" w:hint="cs"/>
-          <w:rtl/>
-        </w:rPr>
-        <w:t xml:space="preserve"> </w:t>
-      </w:r>
-      <w:r>
-        <w:rPr>
-          <w:rFonts w:ascii="David" w:hAnsi="David" w:cs="David"/>
-          <w:rtl/>
-        </w:rPr>
-        <w:t>–</w:t>
-      </w:r>
-      <w:r>
-        <w:rPr>
-          <w:rFonts w:ascii="David" w:hAnsi="David" w:cs="David" w:hint="cs"/>
-          <w:rtl/>
-        </w:rPr>
-        <w:t xml:space="preserve"> מהירות הרכב בתחילת הפנייה. </w:t>
-      </w:r>
-    </w:p>
-    <w:p>
-      <w:pPr>
-        <w:pStyle w:val="ListParagraph"/>
-        <w:numPr>
-          <w:ilvl w:val="1"/>
-          <w:numId w:val="12"/>
-        </w:numPr>
-        <w:spacing w:after="0" w:line="360" w:lineRule="auto"/>
-        <w:rPr>
-          <w:rFonts w:ascii="David" w:hAnsi="David" w:cs="David"/>
-          <w:b/>
-          <w:bCs/>
-        </w:rPr>
-      </w:pPr>
-      <w:r>
-        <w:rPr>
-          <w:rFonts w:ascii="David" w:hAnsi="David" w:cs="David" w:hint="cs"/>
-          <w:rtl/>
-        </w:rPr>
-        <w:t xml:space="preserve">יחידות מידה </w:t>
-      </w:r>
-      <w:r>
-        <w:rPr>
-          <w:rFonts w:ascii="David" w:hAnsi="David" w:cs="David"/>
-          <w:rtl/>
-        </w:rPr>
-        <w:t>–</w:t>
-      </w:r>
-      <w:r>
-        <w:rPr>
-          <w:rFonts w:ascii="David" w:hAnsi="David" w:cs="David" w:hint="cs"/>
-          <w:rtl/>
-        </w:rPr>
-        <w:t xml:space="preserve"> קמ"ש.</w:t>
-      </w:r>
-    </w:p>
-    <w:p>
-      <w:pPr>
-        <w:pStyle w:val="ListParagraph"/>
-        <w:numPr>
-          <w:ilvl w:val="1"/>
-          <w:numId w:val="12"/>
-        </w:numPr>
-        <w:spacing w:after="0" w:line="360" w:lineRule="auto"/>
-        <w:rPr>
-          <w:rFonts w:ascii="David" w:hAnsi="David" w:cs="David"/>
-          <w:b/>
-          <w:bCs/>
-        </w:rPr>
-      </w:pPr>
-      <w:r>
-        <w:rPr>
-          <w:rFonts w:ascii="David" w:hAnsi="David" w:cs="David" w:hint="cs"/>
-          <w:rtl/>
-        </w:rPr>
-        <w:t xml:space="preserve">טווח ערכים אפשרי </w:t>
-      </w:r>
-      <w:r>
-        <w:rPr>
-          <w:rFonts w:ascii="David" w:hAnsi="David" w:cs="David"/>
-          <w:rtl/>
-        </w:rPr>
-        <w:t>–</w:t>
-      </w:r>
-      <w:r>
-        <w:rPr>
-          <w:rFonts w:ascii="David" w:hAnsi="David" w:cs="David" w:hint="cs"/>
-          <w:rtl/>
-        </w:rPr>
-        <w:t xml:space="preserve"> 0 </w:t>
-      </w:r>
-      <w:r>
-        <w:rPr>
-          <w:rFonts w:ascii="David" w:hAnsi="David" w:cs="David"/>
-          <w:rtl/>
-        </w:rPr>
-        <w:t>–</w:t>
-      </w:r>
-      <w:r>
-        <w:rPr>
-          <w:rFonts w:ascii="David" w:hAnsi="David" w:cs="David" w:hint="cs"/>
-          <w:rtl/>
-        </w:rPr>
-        <w:t xml:space="preserve"> 400 קמ"ש.</w:t>
-      </w:r>
-    </w:p>
-    <w:p>
-      <w:pPr>
-        <w:pStyle w:val="ListParagraph"/>
-        <w:numPr>
-          <w:ilvl w:val="0"/>
-          <w:numId w:val="12"/>
-        </w:numPr>
-        <w:spacing w:after="0" w:line="360" w:lineRule="auto"/>
-        <w:rPr>
-          <w:rFonts w:ascii="David" w:hAnsi="David" w:cs="David"/>
-          <w:b/>
-          <w:bCs/>
-        </w:rPr>
-      </w:pPr>
-      <w:r>
-        <w:rPr>
-          <w:rFonts w:ascii="David" w:hAnsi="David" w:cs="David"/>
-        </w:rPr>
-        <w:t>apex_speed</w:t>
-      </w:r>
-      <w:r>
-        <w:rPr>
-          <w:rFonts w:ascii="David" w:hAnsi="David" w:cs="David" w:hint="cs"/>
-          <w:rtl/>
-        </w:rPr>
-        <w:t xml:space="preserve"> </w:t>
-      </w:r>
-      <w:r>
-        <w:rPr>
-          <w:rFonts w:ascii="David" w:hAnsi="David" w:cs="David"/>
-          <w:rtl/>
-        </w:rPr>
-        <w:t>–</w:t>
-      </w:r>
-      <w:r>
-        <w:rPr>
-          <w:rFonts w:ascii="David" w:hAnsi="David" w:cs="David" w:hint="cs"/>
-          <w:rtl/>
-        </w:rPr>
-        <w:t xml:space="preserve"> המהירות המינימלית במהלך הפנייה. </w:t>
-      </w:r>
-    </w:p>
-    <w:p>
-      <w:pPr>
-        <w:pStyle w:val="ListParagraph"/>
-        <w:numPr>
-          <w:ilvl w:val="1"/>
-          <w:numId w:val="12"/>
-        </w:numPr>
-        <w:spacing w:after="0" w:line="360" w:lineRule="auto"/>
-        <w:rPr>
-          <w:rFonts w:ascii="David" w:hAnsi="David" w:cs="David"/>
-          <w:b/>
-          <w:bCs/>
-        </w:rPr>
-      </w:pPr>
-      <w:r>
-        <w:rPr>
-          <w:rFonts w:ascii="David" w:hAnsi="David" w:cs="David" w:hint="cs"/>
-          <w:rtl/>
-        </w:rPr>
-        <w:t xml:space="preserve">יחידות מידה </w:t>
-      </w:r>
-      <w:r>
-        <w:rPr>
-          <w:rFonts w:ascii="David" w:hAnsi="David" w:cs="David"/>
-          <w:rtl/>
-        </w:rPr>
-        <w:t>–</w:t>
-      </w:r>
-      <w:r>
-        <w:rPr>
-          <w:rFonts w:ascii="David" w:hAnsi="David" w:cs="David" w:hint="cs"/>
-          <w:rtl/>
-        </w:rPr>
-        <w:t xml:space="preserve"> קמ"ש.</w:t>
-      </w:r>
-    </w:p>
-    <w:p>
-      <w:pPr>
-        <w:pStyle w:val="ListParagraph"/>
-        <w:numPr>
-          <w:ilvl w:val="1"/>
-          <w:numId w:val="12"/>
-        </w:numPr>
-        <w:spacing w:after="0" w:line="360" w:lineRule="auto"/>
-        <w:rPr>
-          <w:rFonts w:ascii="David" w:hAnsi="David" w:cs="David"/>
-          <w:b/>
-          <w:bCs/>
-        </w:rPr>
-      </w:pPr>
-      <w:r>
-        <w:rPr>
-          <w:rFonts w:ascii="David" w:hAnsi="David" w:cs="David" w:hint="cs"/>
-          <w:rtl/>
-        </w:rPr>
-        <w:t xml:space="preserve">טווח ערכים אפשרי </w:t>
-      </w:r>
-      <w:r>
-        <w:rPr>
-          <w:rFonts w:ascii="David" w:hAnsi="David" w:cs="David"/>
-          <w:rtl/>
-        </w:rPr>
-        <w:t>–</w:t>
-      </w:r>
-      <w:r>
-        <w:rPr>
-          <w:rFonts w:ascii="David" w:hAnsi="David" w:cs="David" w:hint="cs"/>
-          <w:rtl/>
-        </w:rPr>
-        <w:t xml:space="preserve"> 0 </w:t>
-      </w:r>
-      <w:r>
-        <w:rPr>
-          <w:rFonts w:ascii="David" w:hAnsi="David" w:cs="David"/>
-          <w:rtl/>
-        </w:rPr>
-        <w:t>–</w:t>
-      </w:r>
-      <w:r>
-        <w:rPr>
-          <w:rFonts w:ascii="David" w:hAnsi="David" w:cs="David" w:hint="cs"/>
-          <w:rtl/>
-        </w:rPr>
-        <w:t xml:space="preserve"> 200 קמ"ש.</w:t>
-      </w:r>
-    </w:p>
-    <w:p>
-      <w:pPr>
-        <w:pStyle w:val="ListParagraph"/>
-        <w:numPr>
-          <w:ilvl w:val="0"/>
-          <w:numId w:val="12"/>
-        </w:numPr>
-        <w:spacing w:after="0" w:line="360" w:lineRule="auto"/>
-        <w:rPr>
-          <w:rFonts w:ascii="David" w:hAnsi="David" w:cs="David"/>
-          <w:b/>
-          <w:bCs/>
-        </w:rPr>
-      </w:pPr>
-      <w:r>
-        <w:rPr>
-          <w:rFonts w:ascii="David" w:hAnsi="David" w:cs="David"/>
-        </w:rPr>
-        <w:t>exit_speed</w:t>
-      </w:r>
-      <w:r>
-        <w:rPr>
-          <w:rFonts w:ascii="David" w:hAnsi="David" w:cs="David" w:hint="cs"/>
-          <w:rtl/>
-        </w:rPr>
-        <w:t xml:space="preserve"> </w:t>
-      </w:r>
-      <w:r>
-        <w:rPr>
-          <w:rFonts w:ascii="David" w:hAnsi="David" w:cs="David"/>
-          <w:rtl/>
-        </w:rPr>
-        <w:t>–</w:t>
-      </w:r>
-      <w:r>
-        <w:rPr>
-          <w:rFonts w:ascii="David" w:hAnsi="David" w:cs="David" w:hint="cs"/>
-          <w:rtl/>
-        </w:rPr>
-        <w:t xml:space="preserve"> מהירות היציאה של הרכב מהפנייה.</w:t>
-      </w:r>
-    </w:p>
-    <w:p>
-      <w:pPr>
-        <w:pStyle w:val="ListParagraph"/>
-        <w:numPr>
-          <w:ilvl w:val="1"/>
-          <w:numId w:val="12"/>
-        </w:numPr>
-        <w:spacing w:after="0" w:line="360" w:lineRule="auto"/>
-        <w:rPr>
-          <w:rFonts w:ascii="David" w:hAnsi="David" w:cs="David"/>
-          <w:b/>
-          <w:bCs/>
-        </w:rPr>
-      </w:pPr>
-      <w:r>
-        <w:rPr>
-          <w:rFonts w:ascii="David" w:hAnsi="David" w:cs="David" w:hint="cs"/>
-          <w:rtl/>
-        </w:rPr>
-        <w:t xml:space="preserve">יחידות מידה </w:t>
-      </w:r>
-      <w:r>
-        <w:rPr>
-          <w:rFonts w:ascii="David" w:hAnsi="David" w:cs="David"/>
-          <w:rtl/>
-        </w:rPr>
-        <w:t>–</w:t>
-      </w:r>
-      <w:r>
-        <w:rPr>
-          <w:rFonts w:ascii="David" w:hAnsi="David" w:cs="David" w:hint="cs"/>
-          <w:rtl/>
-        </w:rPr>
-        <w:t xml:space="preserve"> קמ"ש.</w:t>
-      </w:r>
-    </w:p>
-    <w:p>
-      <w:pPr>
-        <w:pStyle w:val="ListParagraph"/>
-        <w:numPr>
-          <w:ilvl w:val="1"/>
-          <w:numId w:val="12"/>
-        </w:numPr>
-        <w:spacing w:after="0" w:line="360" w:lineRule="auto"/>
-        <w:rPr>
-          <w:rFonts w:ascii="David" w:hAnsi="David" w:cs="David"/>
-          <w:b/>
-          <w:bCs/>
-        </w:rPr>
-      </w:pPr>
-      <w:r>
-        <w:rPr>
-          <w:rFonts w:ascii="David" w:hAnsi="David" w:cs="David" w:hint="cs"/>
-          <w:rtl/>
-        </w:rPr>
-        <w:t xml:space="preserve">טווח ערכים אפשרי </w:t>
-      </w:r>
-      <w:r>
-        <w:rPr>
-          <w:rFonts w:ascii="David" w:hAnsi="David" w:cs="David"/>
-          <w:rtl/>
-        </w:rPr>
-        <w:t>–</w:t>
-      </w:r>
-      <w:r>
-        <w:rPr>
-          <w:rFonts w:ascii="David" w:hAnsi="David" w:cs="David" w:hint="cs"/>
-          <w:rtl/>
-        </w:rPr>
-        <w:t xml:space="preserve"> </w:t>
-      </w:r>
-      <w:r>
-        <w:rPr>
-          <w:rFonts w:ascii="David" w:hAnsi="David" w:cs="David" w:hint="cs"/>
-          <w:rtl/>
-        </w:rPr>
-        <w:t xml:space="preserve">0 </w:t>
-      </w:r>
-      <w:r>
-        <w:rPr>
-          <w:rFonts w:ascii="David" w:hAnsi="David" w:cs="David"/>
-          <w:rtl/>
-        </w:rPr>
-        <w:t>–</w:t>
-      </w:r>
-      <w:r>
-        <w:rPr>
-          <w:rFonts w:ascii="David" w:hAnsi="David" w:cs="David" w:hint="cs"/>
-          <w:rtl/>
-        </w:rPr>
-        <w:t xml:space="preserve"> 400 קמ"ש.</w:t>
-      </w:r>
-    </w:p>
-    <w:p>
-      <w:pPr>
-        <w:pStyle w:val="ListParagraph"/>
-        <w:numPr>
-          <w:ilvl w:val="0"/>
-          <w:numId w:val="12"/>
-        </w:numPr>
-        <w:spacing w:after="0" w:line="360" w:lineRule="auto"/>
-        <w:rPr>
-          <w:rFonts w:ascii="David" w:hAnsi="David" w:cs="David"/>
-          <w:b/>
-          <w:bCs/>
-        </w:rPr>
-      </w:pPr>
-      <w:r>
-        <w:rPr>
-          <w:rFonts w:ascii="David" w:hAnsi="David" w:cs="David"/>
-        </w:rPr>
-        <w:t>speed_drop</w:t>
-      </w:r>
-      <w:r>
-        <w:rPr>
-          <w:rFonts w:ascii="David" w:hAnsi="David" w:cs="David" w:hint="cs"/>
-          <w:rtl/>
-        </w:rPr>
-        <w:t xml:space="preserve"> </w:t>
-      </w:r>
-      <w:r>
-        <w:rPr>
-          <w:rFonts w:ascii="David" w:hAnsi="David" w:cs="David"/>
-          <w:rtl/>
-        </w:rPr>
-        <w:t>–</w:t>
-      </w:r>
-      <w:r>
-        <w:rPr>
-          <w:rFonts w:ascii="David" w:hAnsi="David" w:cs="David" w:hint="cs"/>
-          <w:rtl/>
-        </w:rPr>
-        <w:t xml:space="preserve"> ההפרש בין המהירות בתחילת הפנייה לבין המהירות המינימלית. </w:t>
-      </w:r>
-    </w:p>
-    <w:p>
-      <w:pPr>
-        <w:pStyle w:val="ListParagraph"/>
-        <w:numPr>
-          <w:ilvl w:val="1"/>
-          <w:numId w:val="12"/>
-        </w:numPr>
-        <w:spacing w:after="0" w:line="360" w:lineRule="auto"/>
-        <w:rPr>
-          <w:rFonts w:ascii="David" w:hAnsi="David" w:cs="David"/>
-          <w:b/>
-          <w:bCs/>
-        </w:rPr>
-      </w:pPr>
-      <w:r>
-        <w:rPr>
-          <w:rFonts w:ascii="David" w:hAnsi="David" w:cs="David" w:hint="cs"/>
-          <w:rtl/>
-        </w:rPr>
-        <w:t xml:space="preserve">יחידות מידה </w:t>
-      </w:r>
-      <w:r>
-        <w:rPr>
-          <w:rFonts w:ascii="David" w:hAnsi="David" w:cs="David"/>
-          <w:rtl/>
-        </w:rPr>
-        <w:t>–</w:t>
-      </w:r>
-      <w:r>
-        <w:rPr>
-          <w:rFonts w:ascii="David" w:hAnsi="David" w:cs="David" w:hint="cs"/>
-          <w:rtl/>
-        </w:rPr>
-        <w:t xml:space="preserve"> קמ"ש.</w:t>
-      </w:r>
-    </w:p>
-    <w:p>
-      <w:pPr>
-        <w:pStyle w:val="ListParagraph"/>
-        <w:numPr>
-          <w:ilvl w:val="1"/>
-          <w:numId w:val="12"/>
-        </w:numPr>
-        <w:spacing w:after="0" w:line="360" w:lineRule="auto"/>
-        <w:rPr>
-          <w:rFonts w:ascii="David" w:hAnsi="David" w:cs="David"/>
-          <w:b/>
-          <w:bCs/>
-        </w:rPr>
-      </w:pPr>
-      <w:r>
-        <w:rPr>
-          <w:rFonts w:ascii="David" w:hAnsi="David" w:cs="David" w:hint="cs"/>
-          <w:rtl/>
-        </w:rPr>
-        <w:t xml:space="preserve">טווח ערכים אפשרי </w:t>
-      </w:r>
-      <w:r>
-        <w:rPr>
-          <w:rFonts w:ascii="David" w:hAnsi="David" w:cs="David"/>
-          <w:rtl/>
-        </w:rPr>
-        <w:t>–</w:t>
-      </w:r>
-      <w:r>
-        <w:rPr>
-          <w:rFonts w:ascii="David" w:hAnsi="David" w:cs="David" w:hint="cs"/>
-          <w:rtl/>
-        </w:rPr>
-        <w:t xml:space="preserve"> 0 </w:t>
-      </w:r>
-      <w:r>
-        <w:rPr>
-          <w:rFonts w:ascii="David" w:hAnsi="David" w:cs="David"/>
-          <w:rtl/>
-        </w:rPr>
-        <w:t>–</w:t>
-      </w:r>
-      <w:r>
-        <w:rPr>
-          <w:rFonts w:ascii="David" w:hAnsi="David" w:cs="David" w:hint="cs"/>
-          <w:rtl/>
-        </w:rPr>
-        <w:t xml:space="preserve"> 400 קמ"ש.</w:t>
-      </w:r>
-    </w:p>
-    <w:p>
-      <w:pPr>
-        <w:pStyle w:val="ListParagraph"/>
-        <w:numPr>
-          <w:ilvl w:val="0"/>
-          <w:numId w:val="12"/>
-        </w:numPr>
-        <w:spacing w:after="0" w:line="360" w:lineRule="auto"/>
-        <w:rPr>
-          <w:rFonts w:ascii="David" w:hAnsi="David" w:cs="David"/>
-          <w:b/>
-          <w:bCs/>
-        </w:rPr>
-      </w:pPr>
-      <w:r>
-        <w:rPr>
-          <w:rFonts w:ascii="David" w:hAnsi="David" w:cs="David"/>
-        </w:rPr>
-        <w:t>min_gear</w:t>
-      </w:r>
-      <w:r>
-        <w:rPr>
-          <w:rFonts w:ascii="David" w:hAnsi="David" w:cs="David" w:hint="cs"/>
-          <w:rtl/>
-        </w:rPr>
-        <w:t xml:space="preserve"> </w:t>
-      </w:r>
-      <w:r>
-        <w:rPr>
-          <w:rFonts w:ascii="David" w:hAnsi="David" w:cs="David"/>
-          <w:rtl/>
-        </w:rPr>
-        <w:t>–</w:t>
-      </w:r>
-      <w:r>
-        <w:rPr>
-          <w:rFonts w:ascii="David" w:hAnsi="David" w:cs="David" w:hint="cs"/>
-          <w:rtl/>
-        </w:rPr>
-        <w:t xml:space="preserve"> ההילוך המינימלי של הרכב במהלך הפנייה. </w:t>
-      </w:r>
-    </w:p>
-    <w:p>
-      <w:pPr>
-        <w:pStyle w:val="ListParagraph"/>
-        <w:numPr>
-          <w:ilvl w:val="1"/>
-          <w:numId w:val="12"/>
-        </w:numPr>
-        <w:spacing w:after="0" w:line="360" w:lineRule="auto"/>
-        <w:rPr>
-          <w:rFonts w:ascii="David" w:hAnsi="David" w:cs="David"/>
-          <w:b/>
-          <w:bCs/>
-        </w:rPr>
-      </w:pPr>
-      <w:r>
-        <w:rPr>
-          <w:rFonts w:ascii="David" w:hAnsi="David" w:cs="David" w:hint="cs"/>
-          <w:rtl/>
-        </w:rPr>
-        <w:t xml:space="preserve">יחידות מידה </w:t>
-      </w:r>
-      <w:r>
-        <w:rPr>
-          <w:rFonts w:ascii="David" w:hAnsi="David" w:cs="David"/>
-          <w:rtl/>
-        </w:rPr>
-        <w:t>–</w:t>
-      </w:r>
-      <w:r>
-        <w:rPr>
-          <w:rFonts w:ascii="David" w:hAnsi="David" w:cs="David" w:hint="cs"/>
-          <w:rtl/>
-        </w:rPr>
-        <w:t xml:space="preserve"> מספרים שלמים בעל ספרה אחת.</w:t>
-      </w:r>
-    </w:p>
-    <w:p>
-      <w:pPr>
-        <w:pStyle w:val="ListParagraph"/>
-        <w:numPr>
-          <w:ilvl w:val="1"/>
-          <w:numId w:val="12"/>
-        </w:numPr>
-        <w:spacing w:after="0" w:line="360" w:lineRule="auto"/>
-        <w:rPr>
-          <w:rFonts w:ascii="David" w:hAnsi="David" w:cs="David"/>
-          <w:b/>
-          <w:bCs/>
-        </w:rPr>
-      </w:pPr>
-      <w:r>
-        <w:rPr>
-          <w:rFonts w:ascii="David" w:hAnsi="David" w:cs="David" w:hint="cs"/>
-          <w:rtl/>
-        </w:rPr>
-        <w:t xml:space="preserve">טווח ערכים אפשרי </w:t>
-      </w:r>
-      <w:r>
-        <w:rPr>
-          <w:rFonts w:ascii="David" w:hAnsi="David" w:cs="David"/>
-          <w:rtl/>
-        </w:rPr>
-        <w:t>–</w:t>
-      </w:r>
-      <w:r>
-        <w:rPr>
-          <w:rFonts w:ascii="David" w:hAnsi="David" w:cs="David" w:hint="cs"/>
-          <w:rtl/>
-        </w:rPr>
-        <w:t xml:space="preserve"> 0 </w:t>
-      </w:r>
-      <w:r>
-        <w:rPr>
-          <w:rFonts w:ascii="David" w:hAnsi="David" w:cs="David"/>
-          <w:rtl/>
-        </w:rPr>
-        <w:t>–</w:t>
-      </w:r>
-      <w:r>
-        <w:rPr>
-          <w:rFonts w:ascii="David" w:hAnsi="David" w:cs="David" w:hint="cs"/>
-          <w:rtl/>
-        </w:rPr>
-        <w:t xml:space="preserve"> 8.</w:t>
-      </w:r>
-    </w:p>
-    <w:p>
-      <w:pPr>
-        <w:pStyle w:val="ListParagraph"/>
-        <w:numPr>
-          <w:ilvl w:val="0"/>
-          <w:numId w:val="12"/>
-        </w:numPr>
-        <w:spacing w:after="0" w:line="360" w:lineRule="auto"/>
-        <w:rPr>
-          <w:rFonts w:ascii="David" w:hAnsi="David" w:cs="David"/>
-          <w:b/>
-          <w:bCs/>
-        </w:rPr>
-      </w:pPr>
-      <w:r>
-        <w:rPr>
-          <w:rFonts w:ascii="David" w:hAnsi="David" w:cs="David"/>
-        </w:rPr>
-        <w:t>avg_throttle</w:t>
-      </w:r>
-      <w:r>
-        <w:rPr>
-          <w:rFonts w:ascii="David" w:hAnsi="David" w:cs="David" w:hint="cs"/>
-          <w:rtl/>
-        </w:rPr>
-        <w:t xml:space="preserve"> </w:t>
-      </w:r>
-      <w:r>
-        <w:rPr>
-          <w:rFonts w:ascii="David" w:hAnsi="David" w:cs="David"/>
-          <w:rtl/>
-        </w:rPr>
-        <w:t>–</w:t>
-      </w:r>
-      <w:r>
-        <w:rPr>
-          <w:rFonts w:ascii="David" w:hAnsi="David" w:cs="David" w:hint="cs"/>
-          <w:rtl/>
-        </w:rPr>
-        <w:t xml:space="preserve"> ממוצע הלחיצה על הגז לאורך הפנייה.</w:t>
-      </w:r>
-    </w:p>
-    <w:p>
-      <w:pPr>
-        <w:pStyle w:val="ListParagraph"/>
-        <w:numPr>
-          <w:ilvl w:val="1"/>
-          <w:numId w:val="12"/>
-        </w:numPr>
-        <w:spacing w:after="0" w:line="360" w:lineRule="auto"/>
-        <w:rPr>
-          <w:rFonts w:ascii="David" w:hAnsi="David" w:cs="David"/>
-          <w:b/>
-          <w:bCs/>
-        </w:rPr>
-      </w:pPr>
-      <w:r>
-        <w:rPr>
-          <w:rFonts w:ascii="David" w:hAnsi="David" w:cs="David" w:hint="cs"/>
-          <w:rtl/>
-        </w:rPr>
-        <w:t xml:space="preserve">יחידות מידה </w:t>
-      </w:r>
-      <w:r>
-        <w:rPr>
-          <w:rFonts w:ascii="David" w:hAnsi="David" w:cs="David"/>
-          <w:rtl/>
-        </w:rPr>
-        <w:t>–</w:t>
-      </w:r>
-      <w:r>
-        <w:rPr>
-          <w:rFonts w:ascii="David" w:hAnsi="David" w:cs="David" w:hint="cs"/>
-          <w:rtl/>
-        </w:rPr>
-        <w:t xml:space="preserve"> אחוזים.</w:t>
-      </w:r>
-    </w:p>
-    <w:p>
-      <w:pPr>
-        <w:pStyle w:val="ListParagraph"/>
-        <w:numPr>
-          <w:ilvl w:val="1"/>
-          <w:numId w:val="12"/>
-        </w:numPr>
-        <w:spacing w:after="0" w:line="360" w:lineRule="auto"/>
-        <w:rPr>
-          <w:rFonts w:ascii="David" w:hAnsi="David" w:cs="David"/>
-          <w:b/>
-          <w:bCs/>
-        </w:rPr>
-      </w:pPr>
-      <w:r>
-        <w:rPr>
-          <w:rFonts w:ascii="David" w:hAnsi="David" w:cs="David" w:hint="cs"/>
-          <w:rtl/>
-        </w:rPr>
-        <w:t xml:space="preserve">טווח ערכים אפשרי </w:t>
-      </w:r>
-      <w:r>
-        <w:rPr>
-          <w:rFonts w:ascii="David" w:hAnsi="David" w:cs="David"/>
-          <w:rtl/>
-        </w:rPr>
-        <w:t>–</w:t>
-      </w:r>
-      <w:r>
-        <w:rPr>
-          <w:rFonts w:ascii="David" w:hAnsi="David" w:cs="David" w:hint="cs"/>
-          <w:rtl/>
-        </w:rPr>
-        <w:t xml:space="preserve"> מספרים עשרוניים בין 0 ל-100</w:t>
-      </w:r>
-      <w:r>
-        <w:rPr>
-          <w:rFonts w:ascii="David" w:hAnsi="David" w:cs="David" w:hint="cs"/>
-          <w:rtl/>
-        </w:rPr>
-        <w:t>.</w:t>
-      </w:r>
-    </w:p>
-    <w:p>
-      <w:pPr>
-        <w:pStyle w:val="ListParagraph"/>
-        <w:numPr>
-          <w:ilvl w:val="0"/>
-          <w:numId w:val="12"/>
-        </w:numPr>
-        <w:spacing w:after="0" w:line="360" w:lineRule="auto"/>
-        <w:rPr>
-          <w:rFonts w:ascii="David" w:hAnsi="David" w:cs="David"/>
-          <w:b/>
-          <w:bCs/>
-        </w:rPr>
-      </w:pPr>
-      <w:r>
-        <w:rPr>
-          <w:rFonts w:ascii="David" w:hAnsi="David" w:cs="David"/>
-        </w:rPr>
-        <w:t>brake_portion</w:t>
-      </w:r>
-      <w:r>
-        <w:rPr>
-          <w:rFonts w:ascii="David" w:hAnsi="David" w:cs="David" w:hint="cs"/>
-          <w:rtl/>
-        </w:rPr>
-        <w:t xml:space="preserve"> </w:t>
-      </w:r>
-      <w:r>
-        <w:rPr>
-          <w:rFonts w:ascii="David" w:hAnsi="David" w:cs="David"/>
-          <w:rtl/>
-        </w:rPr>
-        <w:t>–</w:t>
-      </w:r>
-      <w:r>
-        <w:rPr>
-          <w:rFonts w:ascii="David" w:hAnsi="David" w:cs="David" w:hint="cs"/>
-          <w:rtl/>
-        </w:rPr>
-        <w:t xml:space="preserve"> אחוז </w:t>
-      </w:r>
-      <w:r>
-        <w:rPr>
-          <w:rFonts w:ascii="David" w:hAnsi="David" w:cs="David" w:hint="cs"/>
-          <w:rtl/>
-        </w:rPr>
-        <w:t>זמן הפניה בו הנהג לחץ על הבלם</w:t>
-      </w:r>
-      <w:r>
-        <w:rPr>
-          <w:rFonts w:ascii="David" w:hAnsi="David" w:cs="David" w:hint="cs"/>
-          <w:rtl/>
-        </w:rPr>
-        <w:t>.</w:t>
-      </w:r>
-    </w:p>
-    <w:p>
-      <w:pPr>
-        <w:pStyle w:val="ListParagraph"/>
-        <w:numPr>
-          <w:ilvl w:val="1"/>
-          <w:numId w:val="12"/>
-        </w:numPr>
-        <w:spacing w:after="0" w:line="360" w:lineRule="auto"/>
-        <w:rPr>
-          <w:rFonts w:ascii="David" w:hAnsi="David" w:cs="David"/>
-          <w:b/>
-          <w:bCs/>
-        </w:rPr>
-      </w:pPr>
-      <w:r>
-        <w:rPr>
-          <w:rFonts w:ascii="David" w:hAnsi="David" w:cs="David" w:hint="cs"/>
-          <w:rtl/>
-        </w:rPr>
-        <w:lastRenderedPageBreak/>
-        <w:t xml:space="preserve">יחידות מידה </w:t>
-      </w:r>
-      <w:r>
-        <w:rPr>
-          <w:rFonts w:ascii="David" w:hAnsi="David" w:cs="David"/>
-          <w:rtl/>
-        </w:rPr>
-        <w:t>–</w:t>
-      </w:r>
-      <w:r>
-        <w:rPr>
-          <w:rFonts w:ascii="David" w:hAnsi="David" w:cs="David" w:hint="cs"/>
-          <w:rtl/>
-        </w:rPr>
-        <w:t xml:space="preserve"> אחוזים.</w:t>
-      </w:r>
-    </w:p>
-    <w:p>
-      <w:pPr>
-        <w:pStyle w:val="ListParagraph"/>
-        <w:numPr>
-          <w:ilvl w:val="1"/>
-          <w:numId w:val="12"/>
-        </w:numPr>
-        <w:spacing w:after="0" w:line="360" w:lineRule="auto"/>
-        <w:rPr>
-          <w:rFonts w:ascii="David" w:hAnsi="David" w:cs="David"/>
-          <w:b/>
-          <w:bCs/>
-        </w:rPr>
-      </w:pPr>
-      <w:r>
-        <w:rPr>
-          <w:rFonts w:ascii="David" w:hAnsi="David" w:cs="David" w:hint="cs"/>
-          <w:rtl/>
-        </w:rPr>
-        <w:t xml:space="preserve">טווח ערכים אפשרי </w:t>
-      </w:r>
-      <w:r>
-        <w:rPr>
-          <w:rFonts w:ascii="David" w:hAnsi="David" w:cs="David"/>
-          <w:rtl/>
-        </w:rPr>
-        <w:t>–</w:t>
-      </w:r>
-      <w:r>
-        <w:rPr>
-          <w:rFonts w:ascii="David" w:hAnsi="David" w:cs="David" w:hint="cs"/>
-          <w:rtl/>
-        </w:rPr>
-        <w:t xml:space="preserve"> מספרים עשרוניים בין 0 ל-100.</w:t>
-      </w:r>
-    </w:p>
-    <w:p>
-      <w:pPr>
-        <w:pStyle w:val="ListParagraph"/>
-        <w:numPr>
-          <w:ilvl w:val="0"/>
-          <w:numId w:val="12"/>
-        </w:numPr>
-        <w:spacing w:after="0" w:line="360" w:lineRule="auto"/>
-        <w:rPr>
-          <w:rFonts w:ascii="David" w:hAnsi="David" w:cs="David"/>
-          <w:b/>
-          <w:bCs/>
-        </w:rPr>
-      </w:pPr>
-      <w:r>
-        <w:rPr>
-          <w:rFonts w:ascii="David" w:hAnsi="David" w:cs="David"/>
-        </w:rPr>
-        <w:t>driver_</w:t>
-      </w:r>
-      <w:r>
-        <w:rPr>
-          <w:rFonts w:ascii="David" w:hAnsi="David" w:cs="David"/>
-        </w:rPr>
-        <w:t>key</w:t>
-      </w:r>
-      <w:r>
-        <w:rPr>
-          <w:rFonts w:ascii="David" w:hAnsi="David" w:cs="David" w:hint="cs"/>
-          <w:rtl/>
-        </w:rPr>
-        <w:t xml:space="preserve"> </w:t>
-      </w:r>
-      <w:r>
-        <w:rPr>
-          <w:rFonts w:ascii="David" w:hAnsi="David" w:cs="David"/>
-          <w:rtl/>
-        </w:rPr>
-        <w:t>–</w:t>
-      </w:r>
-      <w:r>
-        <w:rPr>
-          <w:rFonts w:ascii="David" w:hAnsi="David" w:cs="David" w:hint="cs"/>
-          <w:rtl/>
-        </w:rPr>
-        <w:t xml:space="preserve"> מזהה ייחודי שמוקצה לכל נהג. </w:t>
-      </w:r>
-    </w:p>
-    <w:p>
-      <w:pPr>
-        <w:pStyle w:val="ListParagraph"/>
-        <w:numPr>
-          <w:ilvl w:val="1"/>
-          <w:numId w:val="12"/>
-        </w:numPr>
-        <w:spacing w:after="0" w:line="360" w:lineRule="auto"/>
-        <w:rPr>
-          <w:rFonts w:ascii="David" w:hAnsi="David" w:cs="David"/>
-          <w:b/>
-          <w:bCs/>
-        </w:rPr>
-      </w:pPr>
-      <w:r>
-        <w:rPr>
-          <w:rFonts w:ascii="David" w:hAnsi="David" w:cs="David" w:hint="cs"/>
-          <w:rtl/>
-        </w:rPr>
-        <w:t xml:space="preserve">יחידות מידה </w:t>
-      </w:r>
-      <w:r>
-        <w:rPr>
-          <w:rFonts w:ascii="David" w:hAnsi="David" w:cs="David"/>
-          <w:rtl/>
-        </w:rPr>
-        <w:t>–</w:t>
-      </w:r>
-      <w:r>
-        <w:rPr>
-          <w:rFonts w:ascii="David" w:hAnsi="David" w:cs="David" w:hint="cs"/>
-          <w:rtl/>
-        </w:rPr>
-        <w:t xml:space="preserve"> מספר שלם בעל </w:t>
-      </w:r>
-      <w:r>
-        <w:rPr>
-          <w:rFonts w:ascii="David" w:hAnsi="David" w:cs="David" w:hint="cs"/>
-          <w:rtl/>
-        </w:rPr>
-        <w:t>2</w:t>
-      </w:r>
-      <w:r>
-        <w:rPr>
-          <w:rFonts w:ascii="David" w:hAnsi="David" w:cs="David" w:hint="cs"/>
-          <w:rtl/>
-        </w:rPr>
-        <w:t xml:space="preserve"> ספרות.</w:t>
-      </w:r>
-    </w:p>
-    <w:p>
-      <w:pPr>
-        <w:pStyle w:val="ListParagraph"/>
-        <w:numPr>
-          <w:ilvl w:val="1"/>
-          <w:numId w:val="12"/>
-        </w:numPr>
-        <w:spacing w:after="0" w:line="360" w:lineRule="auto"/>
-        <w:rPr>
-          <w:rFonts w:ascii="David" w:hAnsi="David" w:cs="David"/>
-          <w:b/>
-          <w:bCs/>
-        </w:rPr>
-      </w:pPr>
-      <w:r>
-        <w:rPr>
-          <w:rFonts w:ascii="David" w:hAnsi="David" w:cs="David" w:hint="cs"/>
-          <w:rtl/>
-        </w:rPr>
-        <w:t xml:space="preserve">טווח ערכים אפשרי  - מ-0 ועד </w:t>
-      </w:r>
-      <w:r>
-        <w:rPr>
-          <w:rFonts w:ascii="David" w:hAnsi="David" w:cs="David" w:hint="cs"/>
-          <w:rtl/>
-        </w:rPr>
-        <w:t>99</w:t>
-      </w:r>
-      <w:r>
-        <w:rPr>
-          <w:rFonts w:ascii="David" w:hAnsi="David" w:cs="David" w:hint="cs"/>
-          <w:rtl/>
-        </w:rPr>
-        <w:t>.</w:t>
-      </w:r>
-    </w:p>
-    <w:p>
-      <w:pPr>
-        <w:pStyle w:val="ListParagraph"/>
-        <w:numPr>
-          <w:ilvl w:val="0"/>
-          <w:numId w:val="12"/>
-        </w:numPr>
-        <w:spacing w:after="0" w:line="360" w:lineRule="auto"/>
-        <w:rPr>
-          <w:rFonts w:ascii="David" w:hAnsi="David" w:cs="David"/>
-          <w:b/>
-          <w:bCs/>
-        </w:rPr>
-      </w:pPr>
-      <w:r>
-        <w:rPr>
-          <w:rFonts w:ascii="David" w:hAnsi="David" w:cs="David"/>
-        </w:rPr>
-        <w:t>session_</w:t>
-      </w:r>
-      <w:r>
-        <w:rPr>
-          <w:rFonts w:ascii="David" w:hAnsi="David" w:cs="David"/>
-        </w:rPr>
-        <w:t>key</w:t>
-      </w:r>
-      <w:r>
-        <w:rPr>
-          <w:rFonts w:ascii="David" w:hAnsi="David" w:cs="David" w:hint="cs"/>
-          <w:rtl/>
-        </w:rPr>
-        <w:t xml:space="preserve"> </w:t>
-      </w:r>
-      <w:r>
-        <w:rPr>
-          <w:rFonts w:ascii="David" w:hAnsi="David" w:cs="David"/>
-          <w:rtl/>
-        </w:rPr>
-        <w:t>–</w:t>
-      </w:r>
-      <w:r>
-        <w:rPr>
-          <w:rFonts w:ascii="David" w:hAnsi="David" w:cs="David" w:hint="cs"/>
-          <w:rtl/>
-        </w:rPr>
-        <w:t xml:space="preserve"> מזהה ייחודי שמוקצה לכל מירוץ. </w:t>
-      </w:r>
-    </w:p>
-    <w:p>
-      <w:pPr>
-        <w:pStyle w:val="ListParagraph"/>
-        <w:numPr>
-          <w:ilvl w:val="1"/>
-          <w:numId w:val="12"/>
-        </w:numPr>
-        <w:spacing w:after="0" w:line="360" w:lineRule="auto"/>
-        <w:rPr>
-          <w:rFonts w:ascii="David" w:hAnsi="David" w:cs="David"/>
-          <w:b/>
-          <w:bCs/>
-        </w:rPr>
-      </w:pPr>
-      <w:r>
-        <w:rPr>
-          <w:rFonts w:ascii="David" w:hAnsi="David" w:cs="David" w:hint="cs"/>
-          <w:rtl/>
-        </w:rPr>
-        <w:t xml:space="preserve">יחידות מידה </w:t>
-      </w:r>
-      <w:r>
-        <w:rPr>
-          <w:rFonts w:ascii="David" w:hAnsi="David" w:cs="David"/>
-          <w:rtl/>
-        </w:rPr>
-        <w:t>–</w:t>
-      </w:r>
-      <w:r>
-        <w:rPr>
-          <w:rFonts w:ascii="David" w:hAnsi="David" w:cs="David" w:hint="cs"/>
-          <w:rtl/>
-        </w:rPr>
-        <w:t xml:space="preserve"> מספר שלם בעל 4 ספרות.</w:t>
-      </w:r>
-    </w:p>
-    <w:p>
-      <w:pPr>
-        <w:pStyle w:val="ListParagraph"/>
-        <w:numPr>
-          <w:ilvl w:val="1"/>
-          <w:numId w:val="12"/>
-        </w:numPr>
-        <w:spacing w:after="0" w:line="360" w:lineRule="auto"/>
-        <w:rPr>
-          <w:rFonts w:ascii="David" w:hAnsi="David" w:cs="David"/>
-          <w:b/>
-          <w:bCs/>
-        </w:rPr>
-      </w:pPr>
-      <w:r>
-        <w:rPr>
-          <w:rFonts w:ascii="David" w:hAnsi="David" w:cs="David" w:hint="cs"/>
-          <w:rtl/>
-        </w:rPr>
-        <w:t xml:space="preserve">טווח ערכים אפשרי </w:t>
-      </w:r>
-      <w:r>
-        <w:rPr>
-          <w:rFonts w:ascii="David" w:hAnsi="David" w:cs="David"/>
-          <w:rtl/>
-        </w:rPr>
-        <w:t>–</w:t>
-      </w:r>
-      <w:r>
-        <w:rPr>
-          <w:rFonts w:ascii="David" w:hAnsi="David" w:cs="David" w:hint="cs"/>
-          <w:rtl/>
-        </w:rPr>
-        <w:t xml:space="preserve"> מ-0 ועד </w:t>
-      </w:r>
-      <w:r>
-        <w:rPr>
-          <w:rFonts w:ascii="David" w:hAnsi="David" w:cs="David" w:hint="cs"/>
-          <w:rtl/>
-        </w:rPr>
-        <w:t>9999</w:t>
-      </w:r>
-      <w:r>
-        <w:rPr>
-          <w:rFonts w:ascii="David" w:hAnsi="David" w:cs="David" w:hint="cs"/>
-          <w:rtl/>
-        </w:rPr>
-        <w:t>.</w:t>
-      </w:r>
-    </w:p>
-    <w:p>
-      <w:pPr>
-        <w:pStyle w:val="ListParagraph"/>
-        <w:numPr>
-          <w:ilvl w:val="0"/>
-          <w:numId w:val="12"/>
-        </w:numPr>
-        <w:spacing w:after="0" w:line="360" w:lineRule="auto"/>
-        <w:rPr>
-          <w:rFonts w:ascii="David" w:hAnsi="David" w:cs="David"/>
-          <w:b/>
-          <w:bCs/>
-        </w:rPr>
-      </w:pPr>
-      <w:r>
-        <w:rPr>
-          <w:rFonts w:ascii="David" w:hAnsi="David" w:cs="David"/>
-        </w:rPr>
-        <w:t>turn_</w:t>
-      </w:r>
-      <w:r>
-        <w:rPr>
-          <w:rFonts w:ascii="David" w:hAnsi="David" w:cs="David"/>
-        </w:rPr>
-        <w:t>key</w:t>
-      </w:r>
-      <w:r>
-        <w:rPr>
-          <w:rFonts w:ascii="David" w:hAnsi="David" w:cs="David" w:hint="cs"/>
-          <w:rtl/>
-        </w:rPr>
-        <w:t xml:space="preserve"> </w:t>
-      </w:r>
-      <w:r>
-        <w:rPr>
-          <w:rFonts w:ascii="David" w:hAnsi="David" w:cs="David"/>
-          <w:rtl/>
-        </w:rPr>
-        <w:t>–</w:t>
-      </w:r>
-      <w:r>
-        <w:rPr>
-          <w:rFonts w:ascii="David" w:hAnsi="David" w:cs="David" w:hint="cs"/>
-          <w:rtl/>
-        </w:rPr>
-        <w:t xml:space="preserve"> </w:t>
-      </w:r>
-      <w:r>
-        <w:rPr>
-          <w:rFonts w:ascii="David" w:hAnsi="David" w:cs="David" w:hint="cs"/>
-          <w:rtl/>
-        </w:rPr>
-        <w:t>מזהה ייחודי שמוקצה לכל פנייה</w:t>
-      </w:r>
-      <w:r>
-        <w:rPr>
-          <w:rFonts w:ascii="David" w:hAnsi="David" w:cs="David" w:hint="cs"/>
-          <w:rtl/>
-        </w:rPr>
-        <w:t xml:space="preserve">. </w:t>
-      </w:r>
-    </w:p>
-    <w:p>
-      <w:pPr>
-        <w:pStyle w:val="ListParagraph"/>
-        <w:numPr>
-          <w:ilvl w:val="1"/>
-          <w:numId w:val="12"/>
-        </w:numPr>
-        <w:spacing w:after="0" w:line="360" w:lineRule="auto"/>
-        <w:rPr>
-          <w:rFonts w:ascii="David" w:hAnsi="David" w:cs="David"/>
-          <w:b/>
-          <w:bCs/>
-        </w:rPr>
-      </w:pPr>
-      <w:r>
-        <w:rPr>
-          <w:rFonts w:ascii="David" w:hAnsi="David" w:cs="David" w:hint="cs"/>
-          <w:rtl/>
-        </w:rPr>
-        <w:t xml:space="preserve">יחידות מידה </w:t>
-      </w:r>
-      <w:r>
-        <w:rPr>
-          <w:rFonts w:ascii="David" w:hAnsi="David" w:cs="David"/>
-          <w:rtl/>
-        </w:rPr>
-        <w:t>–</w:t>
-      </w:r>
-      <w:r>
-        <w:rPr>
-          <w:rFonts w:ascii="David" w:hAnsi="David" w:cs="David" w:hint="cs"/>
-          <w:rtl/>
-        </w:rPr>
-        <w:t xml:space="preserve"> מספר שלם</w:t>
-      </w:r>
-      <w:r>
-        <w:rPr>
-          <w:rFonts w:ascii="David" w:hAnsi="David" w:cs="David" w:hint="cs"/>
-          <w:rtl/>
-        </w:rPr>
-        <w:t xml:space="preserve"> בעל 3 ספרות</w:t>
-      </w:r>
-      <w:r>
-        <w:rPr>
-          <w:rFonts w:ascii="David" w:hAnsi="David" w:cs="David" w:hint="cs"/>
-          <w:rtl/>
-        </w:rPr>
-        <w:t>.</w:t>
-      </w:r>
-    </w:p>
-    <w:p>
-      <w:pPr>
-        <w:pStyle w:val="ListParagraph"/>
-        <w:numPr>
-          <w:ilvl w:val="1"/>
-          <w:numId w:val="12"/>
-        </w:numPr>
-        <w:spacing w:after="0" w:line="360" w:lineRule="auto"/>
-        <w:rPr>
-          <w:rFonts w:ascii="David" w:hAnsi="David" w:cs="David"/>
-          <w:b/>
-          <w:bCs/>
-        </w:rPr>
-      </w:pPr>
-      <w:r>
-        <w:rPr>
-          <w:rFonts w:ascii="David" w:hAnsi="David" w:cs="David" w:hint="cs"/>
-          <w:rtl/>
-        </w:rPr>
-        <w:t>טווח ערכים אפשרי מ-0 ועד 100.</w:t>
-      </w:r>
-    </w:p>
-    <w:p>
-      <w:pPr>
-        <w:spacing w:after="0" w:line="360" w:lineRule="auto"/>
-        <w:rPr>
-          <w:rFonts w:ascii="David" w:hAnsi="David" w:cs="David"/>
-          <w:b/>
-          <w:bCs/>
-        </w:rPr>
-      </w:pPr>
-    </w:p>
-    <w:p>
-      <w:pPr>
-        <w:spacing w:after="0" w:line="360" w:lineRule="auto"/>
-        <w:rPr>
-          <w:rFonts w:ascii="David" w:hAnsi="David" w:cs="David"/>
         </w:rPr>
       </w:pPr>
     </w:p>
@@ -2629,6 +2670,119 @@
     </w:lvl>
   </w:abstractNum>
   <w:abstractNum w:abstractNumId="5" w15:restartNumberingAfterBreak="0">
+    <w:nsid w:val="1D20189A"/>
+    <w:multiLevelType w:val="hybridMultilevel"/>
+    <w:tmpl w:val="DF401AE4"/>
+    <w:lvl w:ilvl="0" w:tplc="04090001">
+      <w:start w:val="1"/>
+      <w:numFmt w:val="bullet"/>
+      <w:lvlText w:val=""/>
+      <w:lvlJc w:val="left"/>
+      <w:pPr>
+        <w:ind w:left="720" w:hanging="360"/>
+      </w:pPr>
+      <w:rPr>
+        <w:rFonts w:ascii="Symbol" w:hAnsi="Symbol" w:hint="default"/>
+      </w:rPr>
+    </w:lvl>
+    <w:lvl w:ilvl="1" w:tplc="04090003">
+      <w:start w:val="1"/>
+      <w:numFmt w:val="bullet"/>
+      <w:lvlText w:val="o"/>
+      <w:lvlJc w:val="left"/>
+      <w:pPr>
+        <w:ind w:left="1440" w:hanging="360"/>
+      </w:pPr>
+      <w:rPr>
+        <w:rFonts w:ascii="Courier New" w:hAnsi="Courier New" w:hint="default"/>
+      </w:rPr>
+    </w:lvl>
+    <w:lvl w:ilvl="2" w:tplc="04090005">
+      <w:start w:val="1"/>
+      <w:numFmt w:val="bullet"/>
+      <w:lvlText w:val=""/>
+      <w:lvlJc w:val="left"/>
+      <w:pPr>
+        <w:ind w:left="2160" w:hanging="360"/>
+      </w:pPr>
+      <w:rPr>
+        <w:rFonts w:ascii="Wingdings" w:hAnsi="Wingdings" w:hint="default"/>
+      </w:rPr>
+    </w:lvl>
+    <w:lvl w:ilvl="3" w:tplc="04090001" w:tentative="1">
+      <w:start w:val="1"/>
+      <w:numFmt w:val="bullet"/>
+      <w:lvlText w:val=""/>
+      <w:lvlJc w:val="left"/>
+      <w:pPr>
+        <w:ind w:left="2880" w:hanging="360"/>
+      </w:pPr>
+      <w:rPr>
+        <w:rFonts w:ascii="Symbol" w:hAnsi="Symbol" w:hint="default"/>
+      </w:rPr>
+    </w:lvl>
+    <w:lvl w:ilvl="4" w:tplc="04090003" w:tentative="1">
+      <w:start w:val="1"/>
+      <w:numFmt w:val="bullet"/>
+      <w:lvlText w:val="o"/>
+      <w:lvlJc w:val="left"/>
+      <w:pPr>
+        <w:ind w:left="3600" w:hanging="360"/>
+      </w:pPr>
+      <w:rPr>
+        <w:rFonts w:ascii="Courier New" w:hAnsi="Courier New" w:hint="default"/>
+      </w:rPr>
+    </w:lvl>
+    <w:lvl w:ilvl="5" w:tplc="04090005" w:tentative="1">
+      <w:start w:val="1"/>
+      <w:numFmt w:val="bullet"/>
+      <w:lvlText w:val=""/>
+      <w:lvlJc w:val="left"/>
+      <w:pPr>
+        <w:ind w:left="4320" w:hanging="360"/>
+      </w:pPr>
+      <w:rPr>
+        <w:rFonts w:ascii="Wingdings" w:hAnsi="Wingdings" w:hint="default"/>
+      </w:rPr>
+    </w:lvl>
+    <w:lvl w:ilvl="6" w:tplc="04090001" w:tentative="1">
+      <w:start w:val="1"/>
+      <w:numFmt w:val="bullet"/>
+      <w:lvlText w:val=""/>
+      <w:lvlJc w:val="left"/>
+      <w:pPr>
+        <w:ind w:left="5040" w:hanging="360"/>
+      </w:pPr>
+      <w:rPr>
+        <w:rFonts w:ascii="Symbol" w:hAnsi="Symbol" w:hint="default"/>
+      </w:rPr>
+    </w:lvl>
+    <w:lvl w:ilvl="7" w:tplc="04090003" w:tentative="1">
+      <w:start w:val="1"/>
+      <w:numFmt w:val="bullet"/>
+      <w:lvlText w:val="o"/>
+      <w:lvlJc w:val="left"/>
+      <w:pPr>
+        <w:ind w:left="5760" w:hanging="360"/>
+      </w:pPr>
+      <w:rPr>
+        <w:rFonts w:ascii="Courier New" w:hAnsi="Courier New" w:hint="default"/>
+      </w:rPr>
+    </w:lvl>
+    <w:lvl w:ilvl="8" w:tplc="04090005" w:tentative="1">
+      <w:start w:val="1"/>
+      <w:numFmt w:val="bullet"/>
+      <w:lvlText w:val=""/>
+      <w:lvlJc w:val="left"/>
+      <w:pPr>
+        <w:ind w:left="6480" w:hanging="360"/>
+      </w:pPr>
+      <w:rPr>
+        <w:rFonts w:ascii="Wingdings" w:hAnsi="Wingdings" w:hint="default"/>
+      </w:rPr>
+    </w:lvl>
+  </w:abstractNum>
+  <w:abstractNum w:abstractNumId="6" w15:restartNumberingAfterBreak="0">
     <w:nsid w:val="1EB65E12"/>
     <w:multiLevelType w:val="multilevel"/>
     <w:tmpl w:val="4E684A8E"/>
@@ -2777,7 +2931,7 @@
       </w:rPr>
     </w:lvl>
   </w:abstractNum>
-  <w:abstractNum w:abstractNumId="6" w15:restartNumberingAfterBreak="0">
+  <w:abstractNum w:abstractNumId="7" w15:restartNumberingAfterBreak="0">
     <w:nsid w:val="35A82C79"/>
     <w:multiLevelType w:val="multilevel"/>
     <w:tmpl w:val="BFEC4AAA"/>
@@ -2926,7 +3080,7 @@
       </w:rPr>
     </w:lvl>
   </w:abstractNum>
-  <w:abstractNum w:abstractNumId="7" w15:restartNumberingAfterBreak="0">
+  <w:abstractNum w:abstractNumId="8" w15:restartNumberingAfterBreak="0">
     <w:nsid w:val="423773FD"/>
     <w:multiLevelType w:val="hybridMultilevel"/>
     <w:tmpl w:val="10D654DA"/>
@@ -3039,7 +3193,7 @@
       </w:rPr>
     </w:lvl>
   </w:abstractNum>
-  <w:abstractNum w:abstractNumId="8" w15:restartNumberingAfterBreak="0">
+  <w:abstractNum w:abstractNumId="9" w15:restartNumberingAfterBreak="0">
     <w:nsid w:val="471B1AF6"/>
     <w:multiLevelType w:val="hybridMultilevel"/>
     <w:tmpl w:val="0AF266A6"/>
@@ -3152,7 +3306,7 @@
       </w:rPr>
     </w:lvl>
   </w:abstractNum>
-  <w:abstractNum w:abstractNumId="9" w15:restartNumberingAfterBreak="0">
+  <w:abstractNum w:abstractNumId="10" w15:restartNumberingAfterBreak="0">
     <w:nsid w:val="5FE352AB"/>
     <w:multiLevelType w:val="multilevel"/>
     <w:tmpl w:val="825A2B9E"/>
@@ -3301,7 +3455,96 @@
       </w:rPr>
     </w:lvl>
   </w:abstractNum>
-  <w:abstractNum w:abstractNumId="10" w15:restartNumberingAfterBreak="0">
+  <w:abstractNum w:abstractNumId="11" w15:restartNumberingAfterBreak="0">
+    <w:nsid w:val="63242281"/>
+    <w:multiLevelType w:val="hybridMultilevel"/>
+    <w:tmpl w:val="8B68952C"/>
+    <w:lvl w:ilvl="0" w:tplc="0409000F">
+      <w:start w:val="1"/>
+      <w:numFmt w:val="decimal"/>
+      <w:lvlText w:val="%1."/>
+      <w:lvlJc w:val="left"/>
+      <w:pPr>
+        <w:ind w:left="720" w:hanging="360"/>
+      </w:pPr>
+      <w:rPr>
+        <w:rFonts w:hint="default"/>
+      </w:rPr>
+    </w:lvl>
+    <w:lvl w:ilvl="1" w:tplc="04090019" w:tentative="1">
+      <w:start w:val="1"/>
+      <w:numFmt w:val="lowerLetter"/>
+      <w:lvlText w:val="%2."/>
+      <w:lvlJc w:val="left"/>
+      <w:pPr>
+        <w:ind w:left="1440" w:hanging="360"/>
+      </w:pPr>
+    </w:lvl>
+    <w:lvl w:ilvl="2" w:tplc="0409001B" w:tentative="1">
+      <w:start w:val="1"/>
+      <w:numFmt w:val="lowerRoman"/>
+      <w:lvlText w:val="%3."/>
+      <w:lvlJc w:val="right"/>
+      <w:pPr>
+        <w:ind w:left="2160" w:hanging="180"/>
+      </w:pPr>
+    </w:lvl>
+    <w:lvl w:ilvl="3" w:tplc="0409000F" w:tentative="1">
+      <w:start w:val="1"/>
+      <w:numFmt w:val="decimal"/>
+      <w:lvlText w:val="%4."/>
+      <w:lvlJc w:val="left"/>
+      <w:pPr>
+        <w:ind w:left="2880" w:hanging="360"/>
+      </w:pPr>
+    </w:lvl>
+    <w:lvl w:ilvl="4" w:tplc="04090019" w:tentative="1">
+      <w:start w:val="1"/>
+      <w:numFmt w:val="lowerLetter"/>
+      <w:lvlText w:val="%5."/>
+      <w:lvlJc w:val="left"/>
+      <w:pPr>
+        <w:ind w:left="3600" w:hanging="360"/>
+      </w:pPr>
+    </w:lvl>
+    <w:lvl w:ilvl="5" w:tplc="0409001B" w:tentative="1">
+      <w:start w:val="1"/>
+      <w:numFmt w:val="lowerRoman"/>
+      <w:lvlText w:val="%6."/>
+      <w:lvlJc w:val="right"/>
+      <w:pPr>
+        <w:ind w:left="4320" w:hanging="180"/>
+      </w:pPr>
+    </w:lvl>
+    <w:lvl w:ilvl="6" w:tplc="0409000F" w:tentative="1">
+      <w:start w:val="1"/>
+      <w:numFmt w:val="decimal"/>
+      <w:lvlText w:val="%7."/>
+      <w:lvlJc w:val="left"/>
+      <w:pPr>
+        <w:ind w:left="5040" w:hanging="360"/>
+      </w:pPr>
+    </w:lvl>
+    <w:lvl w:ilvl="7" w:tplc="04090019" w:tentative="1">
+      <w:start w:val="1"/>
+      <w:numFmt w:val="lowerLetter"/>
+      <w:lvlText w:val="%8."/>
+      <w:lvlJc w:val="left"/>
+      <w:pPr>
+        <w:ind w:left="5760" w:hanging="360"/>
+      </w:pPr>
+    </w:lvl>
+    <w:lvl w:ilvl="8" w:tplc="0409001B" w:tentative="1">
+      <w:start w:val="1"/>
+      <w:numFmt w:val="lowerRoman"/>
+      <w:lvlText w:val="%9."/>
+      <w:lvlJc w:val="right"/>
+      <w:pPr>
+        <w:ind w:left="6480" w:hanging="180"/>
+      </w:pPr>
+    </w:lvl>
+  </w:abstractNum>
+  <w:abstractNum w:abstractNumId="12" w15:restartNumberingAfterBreak="0">
     <w:nsid w:val="6680171F"/>
     <w:multiLevelType w:val="hybridMultilevel"/>
     <w:tmpl w:val="7A241340"/>
@@ -3414,7 +3657,7 @@
       </w:rPr>
     </w:lvl>
   </w:abstractNum>
-  <w:abstractNum w:abstractNumId="11" w15:restartNumberingAfterBreak="0">
+  <w:abstractNum w:abstractNumId="13" w15:restartNumberingAfterBreak="0">
     <w:nsid w:val="71D430B9"/>
     <w:multiLevelType w:val="hybridMultilevel"/>
     <w:tmpl w:val="DF8A5D78"/>
@@ -3528,7 +3771,7 @@
     </w:lvl>
   </w:abstractNum>
   <w:num w:numId="1" w16cid:durableId="1530338358">
-    <w:abstractNumId w:val="6"/>
+    <w:abstractNumId w:val="7"/>
   </w:num>
   <w:num w:numId="2" w16cid:durableId="2108117014">
     <w:abstractNumId w:val="1"/>
@@ -3537,10 +3780,10 @@
     <w:abstractNumId w:val="3"/>
   </w:num>
   <w:num w:numId="4" w16cid:durableId="1122379871">
-    <w:abstractNumId w:val="5"/>
+    <w:abstractNumId w:val="6"/>
   </w:num>
   <w:num w:numId="5" w16cid:durableId="523710769">
-    <w:abstractNumId w:val="10"/>
+    <w:abstractNumId w:val="12"/>
   </w:num>
   <w:num w:numId="6" w16cid:durableId="1575159623">
     <w:abstractNumId w:val="4"/>
@@ -3549,19 +3792,25 @@
     <w:abstractNumId w:val="0"/>
   </w:num>
   <w:num w:numId="8" w16cid:durableId="1777210099">
+    <w:abstractNumId w:val="10"/>
+  </w:num>
+  <w:num w:numId="9" w16cid:durableId="205877600">
     <w:abstractNumId w:val="9"/>
   </w:num>
-  <w:num w:numId="9" w16cid:durableId="205877600">
+  <w:num w:numId="10" w16cid:durableId="1732845057">
     <w:abstractNumId w:val="8"/>
-  </w:num>
-  <w:num w:numId="10" w16cid:durableId="1732845057">
-    <w:abstractNumId w:val="7"/>
   </w:num>
   <w:num w:numId="11" w16cid:durableId="26956661">
     <w:abstractNumId w:val="2"/>
   </w:num>
   <w:num w:numId="12" w16cid:durableId="1333727492">
+    <w:abstractNumId w:val="13"/>
+  </w:num>
+  <w:num w:numId="13" w16cid:durableId="603268523">
     <w:abstractNumId w:val="11"/>
+  </w:num>
+  <w:num w:numId="14" w16cid:durableId="1452045790">
+    <w:abstractNumId w:val="5"/>
   </w:num>
 </w:numbering>
 </file>
@@ -4499,6 +4748,29 @@
       <w:szCs w:val="20"/>
     </w:rPr>
   </w:style>
+  <w:style w:type="character" w:styleId="Hyperlink">
+    <w:name w:val="Hyperlink"/>
+    <w:basedOn w:val="DefaultParagraphFont"/>
+    <w:uiPriority w:val="99"/>
+    <w:unhideWhenUsed/>
+    <w:rsid w:val="00D65837"/>
+    <w:rPr>
+      <w:color w:val="467886" w:themeColor="hyperlink"/>
+      <w:u w:val="single"/>
+    </w:rPr>
+  </w:style>
+  <w:style w:type="character" w:styleId="UnresolvedMention">
+    <w:name w:val="Unresolved Mention"/>
+    <w:basedOn w:val="DefaultParagraphFont"/>
+    <w:uiPriority w:val="99"/>
+    <w:semiHidden/>
+    <w:unhideWhenUsed/>
+    <w:rsid w:val="00D65837"/>
+    <w:rPr>
+      <w:color w:val="605E5C"/>
+      <w:shd w:val="clear" w:color="auto" w:fill="E1DFDD"/>
+    </w:rPr>
+  </w:style>
 </w:styles>
 </file>
 

</xml_diff>